<commit_message>
DAP QB Ans Week 1-3
</commit_message>
<xml_diff>
--- a/DAP - Data Analysis using Python/DAP_QB_Week_1-12.docx
+++ b/DAP - Data Analysis using Python/DAP_QB_Week_1-12.docx
@@ -10558,625 +10558,74 @@
         </w:rPr>
         <w:t>estimate.</w:t>
       </w:r>
-    </w:p>
-    <w:p>
-      <w:pPr>
-        <w:pStyle w:val="BodyText"/>
-        <w:rPr>
-          <w:sz w:val="20"/>
-        </w:rPr>
-      </w:pPr>
-      <w:r>
-        <w:pict w14:anchorId="0586A357">
-          <v:shapetype id="_x0000_t202" coordsize="21600,21600" o:spt="202" path="m,l,21600r21600,l21600,xe">
-            <v:stroke joinstyle="miter"/>
-            <v:path gradientshapeok="t" o:connecttype="rect"/>
-          </v:shapetype>
-          <v:shape id="_x0000_s1029" type="#_x0000_t202" style="position:absolute;margin-left:1in;margin-top:12.75pt;width:14.65pt;height:13.25pt;z-index:-15728640;mso-wrap-distance-left:0;mso-wrap-distance-right:0;mso-position-horizontal-relative:page" fillcolor="#f8f8f8" stroked="f">
-            <v:textbox inset="0,0,0,0">
-              <w:txbxContent>
-                <w:p>
-                  <w:pPr>
-                    <w:pStyle w:val="BodyText"/>
-                    <w:spacing w:line="250" w:lineRule="exact"/>
-                    <w:ind w:left="-1"/>
-                  </w:pPr>
-                  <w:r>
-                    <w:rPr>
-                      <w:spacing w:val="-1"/>
-                    </w:rPr>
-                    <w:t>14)</w:t>
-                  </w:r>
-                </w:p>
-              </w:txbxContent>
-            </v:textbox>
-            <w10:wrap type="topAndBottom" anchorx="page"/>
-          </v:shape>
-        </w:pict>
-      </w:r>
-      <w:r>
-        <w:pict w14:anchorId="1934E0FA">
-          <v:shape id="_x0000_s1028" type="#_x0000_t202" style="position:absolute;margin-left:89.4pt;margin-top:12.75pt;width:450.6pt;height:13.25pt;z-index:-15728128;mso-wrap-distance-left:0;mso-wrap-distance-right:0;mso-position-horizontal-relative:page" fillcolor="#f8f8f8" stroked="f">
-            <v:textbox inset="0,0,0,0">
-              <w:txbxContent>
-                <w:p>
-                  <w:pPr>
-                    <w:pStyle w:val="BodyText"/>
-                    <w:spacing w:line="250" w:lineRule="exact"/>
-                    <w:ind w:left="-1"/>
-                  </w:pPr>
-                  <w:r>
-                    <w:rPr>
-                      <w:w w:val="95"/>
-                    </w:rPr>
-                    <w:t>A</w:t>
-                  </w:r>
-                  <w:r>
-                    <w:rPr>
-                      <w:spacing w:val="-5"/>
-                      <w:w w:val="95"/>
-                    </w:rPr>
-                    <w:t xml:space="preserve"> </w:t>
-                  </w:r>
-                  <w:r>
-                    <w:rPr>
-                      <w:w w:val="95"/>
-                    </w:rPr>
-                    <w:t>sample</w:t>
-                  </w:r>
-                  <w:r>
-                    <w:rPr>
-                      <w:spacing w:val="-3"/>
-                      <w:w w:val="95"/>
-                    </w:rPr>
-                    <w:t xml:space="preserve"> </w:t>
-                  </w:r>
-                  <w:r>
-                    <w:rPr>
-                      <w:w w:val="95"/>
-                    </w:rPr>
-                    <w:t>of</w:t>
-                  </w:r>
-                  <w:r>
-                    <w:rPr>
-                      <w:spacing w:val="-3"/>
-                      <w:w w:val="95"/>
-                    </w:rPr>
-                    <w:t xml:space="preserve"> </w:t>
-                  </w:r>
-                  <w:r>
-                    <w:rPr>
-                      <w:w w:val="95"/>
-                    </w:rPr>
-                    <w:t>11</w:t>
-                  </w:r>
-                  <w:r>
-                    <w:rPr>
-                      <w:spacing w:val="-4"/>
-                      <w:w w:val="95"/>
-                    </w:rPr>
-                    <w:t xml:space="preserve"> </w:t>
-                  </w:r>
-                  <w:r>
-                    <w:rPr>
-                      <w:w w:val="95"/>
-                    </w:rPr>
-                    <w:t>circuits</w:t>
-                  </w:r>
-                  <w:r>
-                    <w:rPr>
-                      <w:spacing w:val="-4"/>
-                      <w:w w:val="95"/>
-                    </w:rPr>
-                    <w:t xml:space="preserve"> </w:t>
-                  </w:r>
-                  <w:r>
-                    <w:rPr>
-                      <w:w w:val="95"/>
-                    </w:rPr>
-                    <w:t>from</w:t>
-                  </w:r>
-                  <w:r>
-                    <w:rPr>
-                      <w:spacing w:val="-3"/>
-                      <w:w w:val="95"/>
-                    </w:rPr>
-                    <w:t xml:space="preserve"> </w:t>
-                  </w:r>
-                  <w:r>
-                    <w:rPr>
-                      <w:w w:val="95"/>
-                    </w:rPr>
-                    <w:t>a</w:t>
-                  </w:r>
-                  <w:r>
-                    <w:rPr>
-                      <w:spacing w:val="-4"/>
-                      <w:w w:val="95"/>
-                    </w:rPr>
-                    <w:t xml:space="preserve"> </w:t>
-                  </w:r>
-                  <w:r>
-                    <w:rPr>
-                      <w:w w:val="95"/>
-                    </w:rPr>
-                    <w:t>large</w:t>
-                  </w:r>
-                  <w:r>
-                    <w:rPr>
-                      <w:spacing w:val="-4"/>
-                      <w:w w:val="95"/>
-                    </w:rPr>
-                    <w:t xml:space="preserve"> </w:t>
-                  </w:r>
-                  <w:r>
-                    <w:rPr>
-                      <w:w w:val="95"/>
-                    </w:rPr>
-                    <w:t>normal</w:t>
-                  </w:r>
-                  <w:r>
-                    <w:rPr>
-                      <w:spacing w:val="-3"/>
-                      <w:w w:val="95"/>
-                    </w:rPr>
-                    <w:t xml:space="preserve"> </w:t>
-                  </w:r>
-                  <w:r>
-                    <w:rPr>
-                      <w:w w:val="95"/>
-                    </w:rPr>
-                    <w:t>population</w:t>
-                  </w:r>
-                  <w:r>
-                    <w:rPr>
-                      <w:spacing w:val="-2"/>
-                      <w:w w:val="95"/>
-                    </w:rPr>
-                    <w:t xml:space="preserve"> </w:t>
-                  </w:r>
-                  <w:r>
-                    <w:rPr>
-                      <w:w w:val="95"/>
-                    </w:rPr>
-                    <w:t>has</w:t>
-                  </w:r>
-                  <w:r>
-                    <w:rPr>
-                      <w:spacing w:val="-4"/>
-                      <w:w w:val="95"/>
-                    </w:rPr>
-                    <w:t xml:space="preserve"> </w:t>
-                  </w:r>
-                  <w:r>
-                    <w:rPr>
-                      <w:w w:val="95"/>
-                    </w:rPr>
-                    <w:t>a</w:t>
-                  </w:r>
-                  <w:r>
-                    <w:rPr>
-                      <w:spacing w:val="-6"/>
-                      <w:w w:val="95"/>
-                    </w:rPr>
-                    <w:t xml:space="preserve"> </w:t>
-                  </w:r>
-                  <w:r>
-                    <w:rPr>
-                      <w:w w:val="95"/>
-                    </w:rPr>
-                    <w:t>mean</w:t>
-                  </w:r>
-                  <w:r>
-                    <w:rPr>
-                      <w:spacing w:val="-2"/>
-                      <w:w w:val="95"/>
-                    </w:rPr>
-                    <w:t xml:space="preserve"> </w:t>
-                  </w:r>
-                  <w:r>
-                    <w:rPr>
-                      <w:w w:val="95"/>
-                    </w:rPr>
-                    <w:t>resistance</w:t>
-                  </w:r>
-                  <w:r>
-                    <w:rPr>
-                      <w:spacing w:val="-4"/>
-                      <w:w w:val="95"/>
-                    </w:rPr>
-                    <w:t xml:space="preserve"> </w:t>
-                  </w:r>
-                  <w:r>
-                    <w:rPr>
-                      <w:w w:val="95"/>
-                    </w:rPr>
-                    <w:t>of</w:t>
-                  </w:r>
-                  <w:r>
-                    <w:rPr>
-                      <w:spacing w:val="-2"/>
-                      <w:w w:val="95"/>
-                    </w:rPr>
-                    <w:t xml:space="preserve"> </w:t>
-                  </w:r>
-                  <w:r>
-                    <w:rPr>
-                      <w:w w:val="95"/>
-                    </w:rPr>
-                    <w:t>2.20</w:t>
-                  </w:r>
-                  <w:r>
-                    <w:rPr>
-                      <w:spacing w:val="-4"/>
-                      <w:w w:val="95"/>
-                    </w:rPr>
-                    <w:t xml:space="preserve"> </w:t>
-                  </w:r>
-                  <w:r>
-                    <w:rPr>
-                      <w:w w:val="95"/>
-                    </w:rPr>
-                    <w:t>ohms.</w:t>
-                  </w:r>
-                  <w:r>
-                    <w:rPr>
-                      <w:spacing w:val="-4"/>
-                      <w:w w:val="95"/>
-                    </w:rPr>
-                    <w:t xml:space="preserve"> </w:t>
-                  </w:r>
-                  <w:r>
-                    <w:rPr>
-                      <w:w w:val="95"/>
-                    </w:rPr>
-                    <w:t>We</w:t>
-                  </w:r>
-                  <w:r>
-                    <w:rPr>
-                      <w:spacing w:val="-2"/>
-                      <w:w w:val="95"/>
-                    </w:rPr>
-                    <w:t xml:space="preserve"> </w:t>
-                  </w:r>
-                  <w:r>
-                    <w:rPr>
-                      <w:w w:val="95"/>
-                    </w:rPr>
-                    <w:t>know</w:t>
-                  </w:r>
-                </w:p>
-              </w:txbxContent>
-            </v:textbox>
-            <w10:wrap type="topAndBottom" anchorx="page"/>
-          </v:shape>
-        </w:pict>
-      </w:r>
-    </w:p>
-    <w:p>
-      <w:pPr>
-        <w:pStyle w:val="BodyText"/>
-        <w:spacing w:before="21" w:line="288" w:lineRule="auto"/>
-        <w:ind w:left="139" w:right="1269"/>
-      </w:pPr>
-      <w:r>
-        <w:rPr>
-          <w:spacing w:val="-1"/>
-          <w:w w:val="95"/>
-        </w:rPr>
-        <w:t>from</w:t>
-      </w:r>
-      <w:r>
-        <w:rPr>
-          <w:spacing w:val="-9"/>
-          <w:w w:val="95"/>
-        </w:rPr>
-        <w:t xml:space="preserve"> </w:t>
-      </w:r>
-      <w:r>
-        <w:rPr>
-          <w:spacing w:val="-1"/>
-          <w:w w:val="95"/>
-        </w:rPr>
-        <w:t>past</w:t>
-      </w:r>
-      <w:r>
-        <w:rPr>
-          <w:spacing w:val="-8"/>
-          <w:w w:val="95"/>
-        </w:rPr>
-        <w:t xml:space="preserve"> </w:t>
-      </w:r>
-      <w:r>
-        <w:rPr>
-          <w:spacing w:val="-1"/>
-          <w:w w:val="95"/>
-        </w:rPr>
-        <w:t>testing</w:t>
-      </w:r>
-      <w:r>
-        <w:rPr>
-          <w:spacing w:val="-9"/>
-          <w:w w:val="95"/>
-        </w:rPr>
-        <w:t xml:space="preserve"> </w:t>
-      </w:r>
-      <w:r>
-        <w:rPr>
-          <w:spacing w:val="-1"/>
-          <w:w w:val="95"/>
-        </w:rPr>
-        <w:t>that</w:t>
-      </w:r>
-      <w:r>
-        <w:rPr>
-          <w:spacing w:val="-8"/>
-          <w:w w:val="95"/>
-        </w:rPr>
-        <w:t xml:space="preserve"> </w:t>
-      </w:r>
-      <w:r>
-        <w:rPr>
-          <w:spacing w:val="-1"/>
-          <w:w w:val="95"/>
-        </w:rPr>
-        <w:t>the</w:t>
-      </w:r>
-      <w:r>
-        <w:rPr>
-          <w:spacing w:val="-10"/>
-          <w:w w:val="95"/>
-        </w:rPr>
-        <w:t xml:space="preserve"> </w:t>
-      </w:r>
-      <w:r>
-        <w:rPr>
-          <w:spacing w:val="-1"/>
-          <w:w w:val="95"/>
-        </w:rPr>
-        <w:t>population</w:t>
-      </w:r>
-      <w:r>
-        <w:rPr>
-          <w:spacing w:val="-9"/>
-          <w:w w:val="95"/>
-        </w:rPr>
-        <w:t xml:space="preserve"> </w:t>
-      </w:r>
-      <w:r>
-        <w:rPr>
-          <w:w w:val="95"/>
-        </w:rPr>
-        <w:t>standard</w:t>
-      </w:r>
-      <w:r>
-        <w:rPr>
-          <w:spacing w:val="-7"/>
-          <w:w w:val="95"/>
-        </w:rPr>
-        <w:t xml:space="preserve"> </w:t>
-      </w:r>
-      <w:r>
-        <w:rPr>
-          <w:w w:val="95"/>
-        </w:rPr>
-        <w:t>deviation</w:t>
-      </w:r>
-      <w:r>
-        <w:rPr>
-          <w:spacing w:val="-9"/>
-          <w:w w:val="95"/>
-        </w:rPr>
-        <w:t xml:space="preserve"> </w:t>
-      </w:r>
-      <w:r>
-        <w:rPr>
-          <w:w w:val="95"/>
-        </w:rPr>
-        <w:t>is</w:t>
-      </w:r>
-      <w:r>
-        <w:rPr>
-          <w:spacing w:val="-9"/>
-          <w:w w:val="95"/>
-        </w:rPr>
-        <w:t xml:space="preserve"> </w:t>
-      </w:r>
-      <w:r>
-        <w:rPr>
-          <w:w w:val="95"/>
-        </w:rPr>
-        <w:t>0.35</w:t>
-      </w:r>
-      <w:r>
-        <w:rPr>
-          <w:spacing w:val="-9"/>
-          <w:w w:val="95"/>
-        </w:rPr>
-        <w:t xml:space="preserve"> </w:t>
-      </w:r>
-      <w:r>
-        <w:rPr>
-          <w:w w:val="95"/>
-        </w:rPr>
-        <w:t>ohms.</w:t>
-      </w:r>
-      <w:r>
-        <w:rPr>
-          <w:spacing w:val="-8"/>
-          <w:w w:val="95"/>
-        </w:rPr>
-        <w:t xml:space="preserve"> </w:t>
-      </w:r>
-      <w:r>
-        <w:rPr>
-          <w:w w:val="95"/>
-        </w:rPr>
-        <w:t>Determine</w:t>
-      </w:r>
-      <w:r>
-        <w:rPr>
-          <w:spacing w:val="-7"/>
-          <w:w w:val="95"/>
-        </w:rPr>
-        <w:t xml:space="preserve"> </w:t>
-      </w:r>
-      <w:r>
-        <w:rPr>
-          <w:w w:val="95"/>
-        </w:rPr>
-        <w:t>a</w:t>
-      </w:r>
-      <w:r>
-        <w:rPr>
-          <w:spacing w:val="-11"/>
-          <w:w w:val="95"/>
-        </w:rPr>
-        <w:t xml:space="preserve"> </w:t>
-      </w:r>
-      <w:r>
-        <w:rPr>
-          <w:w w:val="95"/>
-        </w:rPr>
-        <w:t>95%</w:t>
-      </w:r>
-      <w:r>
-        <w:rPr>
-          <w:spacing w:val="-9"/>
-          <w:w w:val="95"/>
-        </w:rPr>
-        <w:t xml:space="preserve"> </w:t>
-      </w:r>
-      <w:r>
-        <w:rPr>
-          <w:w w:val="95"/>
-        </w:rPr>
-        <w:t>confidence</w:t>
-      </w:r>
-      <w:r>
-        <w:rPr>
-          <w:spacing w:val="-49"/>
-          <w:w w:val="95"/>
-        </w:rPr>
-        <w:t xml:space="preserve"> </w:t>
-      </w:r>
-      <w:r>
-        <w:rPr>
-          <w:shd w:val="clear" w:color="auto" w:fill="F8F8F8"/>
-        </w:rPr>
-        <w:t>interval</w:t>
-      </w:r>
-      <w:r>
-        <w:rPr>
-          <w:spacing w:val="-4"/>
-          <w:shd w:val="clear" w:color="auto" w:fill="F8F8F8"/>
-        </w:rPr>
-        <w:t xml:space="preserve"> </w:t>
-      </w:r>
-      <w:r>
-        <w:rPr>
-          <w:shd w:val="clear" w:color="auto" w:fill="F8F8F8"/>
-        </w:rPr>
-        <w:t>for</w:t>
-      </w:r>
-      <w:r>
-        <w:rPr>
-          <w:spacing w:val="-7"/>
-          <w:shd w:val="clear" w:color="auto" w:fill="F8F8F8"/>
-        </w:rPr>
-        <w:t xml:space="preserve"> </w:t>
-      </w:r>
-      <w:r>
-        <w:rPr>
-          <w:shd w:val="clear" w:color="auto" w:fill="F8F8F8"/>
-        </w:rPr>
-        <w:t>the</w:t>
-      </w:r>
-      <w:r>
-        <w:rPr>
-          <w:spacing w:val="-5"/>
-          <w:shd w:val="clear" w:color="auto" w:fill="F8F8F8"/>
-        </w:rPr>
-        <w:t xml:space="preserve"> </w:t>
-      </w:r>
-      <w:r>
-        <w:rPr>
-          <w:shd w:val="clear" w:color="auto" w:fill="F8F8F8"/>
-        </w:rPr>
-        <w:t>true</w:t>
-      </w:r>
-      <w:r>
-        <w:rPr>
-          <w:spacing w:val="-3"/>
-          <w:shd w:val="clear" w:color="auto" w:fill="F8F8F8"/>
-        </w:rPr>
-        <w:t xml:space="preserve"> </w:t>
-      </w:r>
-      <w:r>
-        <w:rPr>
-          <w:shd w:val="clear" w:color="auto" w:fill="F8F8F8"/>
-        </w:rPr>
-        <w:t>mean</w:t>
-      </w:r>
-      <w:r>
-        <w:rPr>
-          <w:spacing w:val="-3"/>
-          <w:shd w:val="clear" w:color="auto" w:fill="F8F8F8"/>
-        </w:rPr>
-        <w:t xml:space="preserve"> </w:t>
-      </w:r>
-      <w:r>
-        <w:rPr>
-          <w:shd w:val="clear" w:color="auto" w:fill="F8F8F8"/>
-        </w:rPr>
-        <w:t>resistance</w:t>
-      </w:r>
-      <w:r>
-        <w:rPr>
-          <w:spacing w:val="-5"/>
-          <w:shd w:val="clear" w:color="auto" w:fill="F8F8F8"/>
-        </w:rPr>
-        <w:t xml:space="preserve"> </w:t>
-      </w:r>
-      <w:r>
-        <w:rPr>
-          <w:shd w:val="clear" w:color="auto" w:fill="F8F8F8"/>
-        </w:rPr>
-        <w:t>of</w:t>
-      </w:r>
-      <w:r>
-        <w:rPr>
-          <w:spacing w:val="-4"/>
-          <w:shd w:val="clear" w:color="auto" w:fill="F8F8F8"/>
-        </w:rPr>
-        <w:t xml:space="preserve"> </w:t>
-      </w:r>
-      <w:r>
-        <w:rPr>
-          <w:shd w:val="clear" w:color="auto" w:fill="F8F8F8"/>
-        </w:rPr>
-        <w:t>the</w:t>
-      </w:r>
-      <w:r>
-        <w:rPr>
-          <w:spacing w:val="-5"/>
-          <w:shd w:val="clear" w:color="auto" w:fill="F8F8F8"/>
-        </w:rPr>
-        <w:t xml:space="preserve"> </w:t>
-      </w:r>
-      <w:r>
-        <w:rPr>
-          <w:shd w:val="clear" w:color="auto" w:fill="F8F8F8"/>
-        </w:rPr>
-        <w:t>population.</w:t>
-      </w:r>
-    </w:p>
-    <w:p>
-      <w:pPr>
-        <w:pStyle w:val="BodyText"/>
-        <w:spacing w:before="11"/>
-        <w:rPr>
-          <w:sz w:val="11"/>
+      <w:r>
+        <w:rPr>
+          <w:rFonts w:ascii="Cambria" w:eastAsia="Cambria" w:hAnsi="Cambria" w:cs="Cambria"/>
+        </w:rPr>
+        <w:t xml:space="preserve"> </w:t>
+      </w:r>
+    </w:p>
+    <w:p>
+      <w:pPr>
+        <w:pStyle w:val="ListParagraph"/>
+        <w:rPr>
+          <w:b/>
+          <w:w w:val="95"/>
+          <w:shd w:val="clear" w:color="auto" w:fill="F8F8F8"/>
+        </w:rPr>
+      </w:pPr>
+    </w:p>
+    <w:p>
+      <w:pPr>
+        <w:pStyle w:val="ListParagraph"/>
+        <w:numPr>
+          <w:ilvl w:val="0"/>
+          <w:numId w:val="12"/>
+        </w:numPr>
+        <w:tabs>
+          <w:tab w:val="left" w:pos="488"/>
+        </w:tabs>
+        <w:spacing w:before="64"/>
+        <w:ind w:left="488" w:hanging="349"/>
+        <w:rPr>
+          <w:b/>
+        </w:rPr>
+      </w:pPr>
+      <w:r>
+        <w:rPr>
+          <w:b/>
+          <w:w w:val="95"/>
+          <w:shd w:val="clear" w:color="auto" w:fill="F8F8F8"/>
+        </w:rPr>
+        <w:t xml:space="preserve">A sample of 11 circuits from a large normal population has a mean resistance of 2.20 ohms. We </w:t>
+      </w:r>
+      <w:proofErr w:type="spellStart"/>
+      <w:r>
+        <w:rPr>
+          <w:b/>
+          <w:w w:val="95"/>
+          <w:shd w:val="clear" w:color="auto" w:fill="F8F8F8"/>
+        </w:rPr>
+        <w:t>knowfrom</w:t>
+      </w:r>
+      <w:proofErr w:type="spellEnd"/>
+      <w:r>
+        <w:rPr>
+          <w:b/>
+          <w:w w:val="95"/>
+          <w:shd w:val="clear" w:color="auto" w:fill="F8F8F8"/>
+        </w:rPr>
+        <w:t xml:space="preserve"> past testing that the population standard deviation is 0.35 ohms. Determine a 95%confidence interval for the true mean resistance of the population.</w:t>
+      </w:r>
+    </w:p>
+    <w:p>
+      <w:pPr>
+        <w:tabs>
+          <w:tab w:val="left" w:pos="488"/>
+        </w:tabs>
+        <w:spacing w:before="64"/>
+        <w:rPr>
+          <w:b/>
         </w:rPr>
       </w:pPr>
     </w:p>
@@ -11196,13 +10645,6 @@
           <w:b/>
         </w:rPr>
       </w:pPr>
-      <w:r>
-        <w:pict w14:anchorId="1CA79C48">
-          <v:rect id="_x0000_s1027" style="position:absolute;left:0;text-align:left;margin-left:1in;margin-top:-37.1pt;width:437.8pt;height:13.25pt;z-index:-16041984;mso-position-horizontal-relative:page" fillcolor="#f8f8f8" stroked="f">
-            <w10:wrap anchorx="page"/>
-          </v:rect>
-        </w:pict>
-      </w:r>
       <w:r>
         <w:rPr>
           <w:b/>
@@ -18891,6 +18333,10 @@
       </w:pPr>
       <w:r>
         <w:pict w14:anchorId="6523383E">
+          <v:shapetype id="_x0000_t202" coordsize="21600,21600" o:spt="202" path="m,l,21600r21600,l21600,xe">
+            <v:stroke joinstyle="miter"/>
+            <v:path gradientshapeok="t" o:connecttype="rect"/>
+          </v:shapetype>
           <v:shape id="_x0000_s1026" type="#_x0000_t202" style="position:absolute;margin-left:1in;margin-top:14.15pt;width:468pt;height:40.45pt;z-index:-15727104;mso-wrap-distance-left:0;mso-wrap-distance-right:0;mso-position-horizontal-relative:page" fillcolor="#f8f8f8" stroked="f">
             <v:textbox inset="0,0,0,0">
               <w:txbxContent>
@@ -37832,7 +37278,6 @@
   <w:style w:type="character" w:default="1" w:styleId="DefaultParagraphFont">
     <w:name w:val="Default Paragraph Font"/>
     <w:uiPriority w:val="1"/>
-    <w:semiHidden/>
     <w:unhideWhenUsed/>
   </w:style>
   <w:style w:type="table" w:default="1" w:styleId="TableNormal">

</xml_diff>

<commit_message>
DAP QB Week 6 Ans
</commit_message>
<xml_diff>
--- a/DAP - Data Analysis using Python/DAP_QB_Week_1-12.docx
+++ b/DAP - Data Analysis using Python/DAP_QB_Week_1-12.docx
@@ -1343,12 +1343,14 @@
         </w:rPr>
         <w:t xml:space="preserve"> </w:t>
       </w:r>
+      <w:proofErr w:type="spellStart"/>
       <w:r>
         <w:rPr>
           <w:w w:val="95"/>
         </w:rPr>
         <w:t>Subsetting</w:t>
       </w:r>
+      <w:proofErr w:type="spellEnd"/>
       <w:r>
         <w:rPr>
           <w:spacing w:val="-7"/>
@@ -1425,8 +1427,16 @@
         <w:rPr>
           <w:w w:val="95"/>
         </w:rPr>
-        <w:t>Number: iloc</w:t>
-      </w:r>
+        <w:t xml:space="preserve">Number: </w:t>
+      </w:r>
+      <w:proofErr w:type="spellStart"/>
+      <w:r>
+        <w:rPr>
+          <w:w w:val="95"/>
+        </w:rPr>
+        <w:t>iloc</w:t>
+      </w:r>
+      <w:proofErr w:type="spellEnd"/>
       <w:r>
         <w:rPr>
           <w:spacing w:val="-50"/>
@@ -1434,9 +1444,11 @@
         </w:rPr>
         <w:t xml:space="preserve"> </w:t>
       </w:r>
+      <w:proofErr w:type="spellStart"/>
       <w:r>
         <w:t>Subsetting</w:t>
       </w:r>
+      <w:proofErr w:type="spellEnd"/>
       <w:r>
         <w:rPr>
           <w:spacing w:val="-5"/>
@@ -1453,8 +1465,13 @@
         <w:spacing w:line="480" w:lineRule="auto"/>
         <w:ind w:left="139" w:right="6863"/>
       </w:pPr>
-      <w:r>
-        <w:t>Subsetting Columns by Range</w:t>
+      <w:proofErr w:type="spellStart"/>
+      <w:r>
+        <w:t>Subsetting</w:t>
+      </w:r>
+      <w:proofErr w:type="spellEnd"/>
+      <w:r>
+        <w:t xml:space="preserve"> Columns by Range</w:t>
       </w:r>
       <w:r>
         <w:rPr>
@@ -1462,8 +1479,13 @@
         </w:rPr>
         <w:t xml:space="preserve"> </w:t>
       </w:r>
-      <w:r>
-        <w:t>Subsetting Rows and Columns</w:t>
+      <w:proofErr w:type="spellStart"/>
+      <w:r>
+        <w:t>Subsetting</w:t>
+      </w:r>
+      <w:proofErr w:type="spellEnd"/>
+      <w:r>
+        <w:t xml:space="preserve"> Rows and Columns</w:t>
       </w:r>
       <w:r>
         <w:rPr>
@@ -1471,6 +1493,7 @@
         </w:rPr>
         <w:t xml:space="preserve"> </w:t>
       </w:r>
+      <w:proofErr w:type="spellStart"/>
       <w:r>
         <w:rPr>
           <w:spacing w:val="-1"/>
@@ -1478,6 +1501,7 @@
         </w:rPr>
         <w:t>Subsetting</w:t>
       </w:r>
+      <w:proofErr w:type="spellEnd"/>
       <w:r>
         <w:rPr>
           <w:spacing w:val="-8"/>
@@ -4416,13 +4440,23 @@
         </w:rPr>
         <w:t xml:space="preserve"> </w:t>
       </w:r>
+      <w:proofErr w:type="spellStart"/>
       <w:r>
         <w:rPr>
           <w:b/>
           <w:spacing w:val="-1"/>
           <w:w w:val="95"/>
         </w:rPr>
-        <w:t>joint,union,</w:t>
+        <w:t>joint,union</w:t>
+      </w:r>
+      <w:proofErr w:type="spellEnd"/>
+      <w:r>
+        <w:rPr>
+          <w:b/>
+          <w:spacing w:val="-1"/>
+          <w:w w:val="95"/>
+        </w:rPr>
+        <w:t>,</w:t>
       </w:r>
       <w:r>
         <w:rPr>
@@ -6972,6 +7006,7 @@
         </w:rPr>
         <w:t xml:space="preserve"> </w:t>
       </w:r>
+      <w:proofErr w:type="spellStart"/>
       <w:r>
         <w:rPr>
           <w:b/>
@@ -6980,6 +7015,7 @@
         </w:rPr>
         <w:t>pounds.What</w:t>
       </w:r>
+      <w:proofErr w:type="spellEnd"/>
       <w:r>
         <w:rPr>
           <w:b/>
@@ -7239,6 +7275,7 @@
         </w:rPr>
         <w:t xml:space="preserve"> </w:t>
       </w:r>
+      <w:proofErr w:type="spellStart"/>
       <w:r>
         <w:rPr>
           <w:b/>
@@ -7247,6 +7284,7 @@
         </w:rPr>
         <w:t>theprobability</w:t>
       </w:r>
+      <w:proofErr w:type="spellEnd"/>
       <w:r>
         <w:rPr>
           <w:b/>
@@ -8737,6 +8775,7 @@
         </w:rPr>
         <w:t xml:space="preserve"> </w:t>
       </w:r>
+      <w:proofErr w:type="gramStart"/>
       <w:r>
         <w:rPr>
           <w:b/>
@@ -8762,6 +8801,7 @@
         </w:rPr>
         <w:t>should</w:t>
       </w:r>
+      <w:proofErr w:type="gramEnd"/>
       <w:r>
         <w:rPr>
           <w:b/>
@@ -12610,7 +12650,27 @@
           <w:w w:val="95"/>
           <w:shd w:val="clear" w:color="auto" w:fill="F8F8F8"/>
         </w:rPr>
-        <w:t>are 4 alternative answers (A, B, C or D), of which only one is correct. Mr X answers these questions</w:t>
+        <w:t xml:space="preserve">are 4 alternative answers (A, B, C or D), of which only one is correct. </w:t>
+      </w:r>
+      <w:proofErr w:type="spellStart"/>
+      <w:r>
+        <w:rPr>
+          <w:b/>
+          <w:color w:val="333333"/>
+          <w:w w:val="95"/>
+          <w:shd w:val="clear" w:color="auto" w:fill="F8F8F8"/>
+        </w:rPr>
+        <w:t>Mr</w:t>
+      </w:r>
+      <w:proofErr w:type="spellEnd"/>
+      <w:r>
+        <w:rPr>
+          <w:b/>
+          <w:color w:val="333333"/>
+          <w:w w:val="95"/>
+          <w:shd w:val="clear" w:color="auto" w:fill="F8F8F8"/>
+        </w:rPr>
+        <w:t xml:space="preserve"> X answers these questions</w:t>
       </w:r>
       <w:r>
         <w:rPr>
@@ -13995,13 +14055,23 @@
         </w:rPr>
         <w:t xml:space="preserve"> </w:t>
       </w:r>
-      <w:r>
-        <w:rPr>
-          <w:b/>
-          <w:color w:val="333333"/>
-          <w:shd w:val="clear" w:color="auto" w:fill="F8F8F8"/>
-        </w:rPr>
-        <w:t>car:</w:t>
+      <w:proofErr w:type="gramStart"/>
+      <w:r>
+        <w:rPr>
+          <w:b/>
+          <w:color w:val="333333"/>
+          <w:shd w:val="clear" w:color="auto" w:fill="F8F8F8"/>
+        </w:rPr>
+        <w:t>car</w:t>
+      </w:r>
+      <w:proofErr w:type="gramEnd"/>
+      <w:r>
+        <w:rPr>
+          <w:b/>
+          <w:color w:val="333333"/>
+          <w:shd w:val="clear" w:color="auto" w:fill="F8F8F8"/>
+        </w:rPr>
+        <w:t>:</w:t>
       </w:r>
     </w:p>
     <w:p>
@@ -17460,14 +17530,6 @@
     <w:p>
       <w:pPr>
         <w:pStyle w:val="BodyText"/>
-        <w:rPr>
-          <w:sz w:val="20"/>
-        </w:rPr>
-      </w:pPr>
-    </w:p>
-    <w:p>
-      <w:pPr>
-        <w:pStyle w:val="BodyText"/>
         <w:spacing w:before="10"/>
         <w:rPr>
           <w:sz w:val="20"/>
@@ -18328,1085 +18390,667 @@
     </w:p>
     <w:p>
       <w:pPr>
+        <w:pStyle w:val="ListParagraph"/>
+        <w:rPr>
+          <w:b/>
+          <w:color w:val="263138"/>
+          <w:sz w:val="20"/>
+        </w:rPr>
+      </w:pPr>
+    </w:p>
+    <w:p>
+      <w:pPr>
         <w:pStyle w:val="BodyText"/>
-        <w:spacing w:before="6"/>
-      </w:pPr>
-      <w:r>
-        <w:pict w14:anchorId="6523383E">
-          <v:shapetype id="_x0000_t202" coordsize="21600,21600" o:spt="202" path="m,l,21600r21600,l21600,xe">
-            <v:stroke joinstyle="miter"/>
-            <v:path gradientshapeok="t" o:connecttype="rect"/>
-          </v:shapetype>
-          <v:shape id="_x0000_s1026" type="#_x0000_t202" style="position:absolute;margin-left:1in;margin-top:14.15pt;width:468pt;height:40.45pt;z-index:-15727104;mso-wrap-distance-left:0;mso-wrap-distance-right:0;mso-position-horizontal-relative:page" fillcolor="#f8f8f8" stroked="f">
-            <v:textbox inset="0,0,0,0">
-              <w:txbxContent>
-                <w:p>
-                  <w:pPr>
-                    <w:pStyle w:val="BodyText"/>
-                    <w:numPr>
-                      <w:ilvl w:val="0"/>
-                      <w:numId w:val="8"/>
-                    </w:numPr>
-                    <w:tabs>
-                      <w:tab w:val="left" w:pos="238"/>
-                    </w:tabs>
-                    <w:spacing w:line="250" w:lineRule="exact"/>
-                    <w:ind w:hanging="239"/>
-                  </w:pPr>
-                  <w:r>
-                    <w:rPr>
-                      <w:color w:val="333333"/>
-                      <w:w w:val="95"/>
-                    </w:rPr>
-                    <w:t>In</w:t>
-                  </w:r>
-                  <w:r>
-                    <w:rPr>
-                      <w:color w:val="333333"/>
-                      <w:spacing w:val="1"/>
-                      <w:w w:val="95"/>
-                    </w:rPr>
-                    <w:t xml:space="preserve"> </w:t>
-                  </w:r>
-                  <w:r>
-                    <w:rPr>
-                      <w:color w:val="333333"/>
-                      <w:w w:val="95"/>
-                    </w:rPr>
-                    <w:t>an</w:t>
-                  </w:r>
-                  <w:r>
-                    <w:rPr>
-                      <w:color w:val="333333"/>
-                      <w:spacing w:val="3"/>
-                      <w:w w:val="95"/>
-                    </w:rPr>
-                    <w:t xml:space="preserve"> </w:t>
-                  </w:r>
-                  <w:r>
-                    <w:rPr>
-                      <w:color w:val="333333"/>
-                      <w:w w:val="95"/>
-                    </w:rPr>
-                    <w:t>ANOVA</w:t>
-                  </w:r>
-                  <w:r>
-                    <w:rPr>
-                      <w:color w:val="333333"/>
-                      <w:spacing w:val="2"/>
-                      <w:w w:val="95"/>
-                    </w:rPr>
-                    <w:t xml:space="preserve"> </w:t>
-                  </w:r>
-                  <w:r>
-                    <w:rPr>
-                      <w:color w:val="333333"/>
-                      <w:w w:val="95"/>
-                    </w:rPr>
-                    <w:t>problem</w:t>
-                  </w:r>
-                  <w:r>
-                    <w:rPr>
-                      <w:color w:val="333333"/>
-                      <w:spacing w:val="2"/>
-                      <w:w w:val="95"/>
-                    </w:rPr>
-                    <w:t xml:space="preserve"> </w:t>
-                  </w:r>
-                  <w:r>
-                    <w:rPr>
-                      <w:color w:val="333333"/>
-                      <w:w w:val="95"/>
-                    </w:rPr>
-                    <w:t>if</w:t>
-                  </w:r>
-                  <w:r>
-                    <w:rPr>
-                      <w:color w:val="333333"/>
-                      <w:spacing w:val="2"/>
-                      <w:w w:val="95"/>
-                    </w:rPr>
-                    <w:t xml:space="preserve"> </w:t>
-                  </w:r>
-                  <w:r>
-                    <w:rPr>
-                      <w:color w:val="333333"/>
-                      <w:w w:val="95"/>
-                    </w:rPr>
-                    <w:t>SST</w:t>
-                  </w:r>
-                  <w:r>
-                    <w:rPr>
-                      <w:color w:val="333333"/>
-                      <w:spacing w:val="3"/>
-                      <w:w w:val="95"/>
-                    </w:rPr>
-                    <w:t xml:space="preserve"> </w:t>
-                  </w:r>
-                  <w:r>
-                    <w:rPr>
-                      <w:color w:val="333333"/>
-                      <w:w w:val="95"/>
-                    </w:rPr>
-                    <w:t>=</w:t>
-                  </w:r>
-                  <w:r>
-                    <w:rPr>
-                      <w:color w:val="333333"/>
-                      <w:spacing w:val="1"/>
-                      <w:w w:val="95"/>
-                    </w:rPr>
-                    <w:t xml:space="preserve"> </w:t>
-                  </w:r>
-                  <w:r>
-                    <w:rPr>
-                      <w:color w:val="333333"/>
-                      <w:w w:val="95"/>
-                    </w:rPr>
-                    <w:t>120</w:t>
-                  </w:r>
-                  <w:r>
-                    <w:rPr>
-                      <w:color w:val="333333"/>
-                      <w:spacing w:val="1"/>
-                      <w:w w:val="95"/>
-                    </w:rPr>
-                    <w:t xml:space="preserve"> </w:t>
-                  </w:r>
-                  <w:r>
-                    <w:rPr>
-                      <w:color w:val="333333"/>
-                      <w:w w:val="95"/>
-                    </w:rPr>
-                    <w:t>and</w:t>
-                  </w:r>
-                  <w:r>
-                    <w:rPr>
-                      <w:color w:val="333333"/>
-                      <w:spacing w:val="1"/>
-                      <w:w w:val="95"/>
-                    </w:rPr>
-                    <w:t xml:space="preserve"> </w:t>
-                  </w:r>
-                  <w:r>
-                    <w:rPr>
-                      <w:color w:val="333333"/>
-                      <w:w w:val="95"/>
-                    </w:rPr>
-                    <w:t>SSTR</w:t>
-                  </w:r>
-                  <w:r>
-                    <w:rPr>
-                      <w:color w:val="333333"/>
-                      <w:spacing w:val="2"/>
-                      <w:w w:val="95"/>
-                    </w:rPr>
-                    <w:t xml:space="preserve"> </w:t>
-                  </w:r>
-                  <w:r>
-                    <w:rPr>
-                      <w:color w:val="333333"/>
-                      <w:w w:val="95"/>
-                    </w:rPr>
-                    <w:t>=</w:t>
-                  </w:r>
-                  <w:r>
-                    <w:rPr>
-                      <w:color w:val="333333"/>
-                      <w:spacing w:val="1"/>
-                      <w:w w:val="95"/>
-                    </w:rPr>
-                    <w:t xml:space="preserve"> </w:t>
-                  </w:r>
-                  <w:r>
-                    <w:rPr>
-                      <w:color w:val="333333"/>
-                      <w:w w:val="95"/>
-                    </w:rPr>
-                    <w:t>80,</w:t>
-                  </w:r>
-                  <w:r>
-                    <w:rPr>
-                      <w:color w:val="333333"/>
-                      <w:spacing w:val="1"/>
-                      <w:w w:val="95"/>
-                    </w:rPr>
-                    <w:t xml:space="preserve"> </w:t>
-                  </w:r>
-                  <w:r>
-                    <w:rPr>
-                      <w:color w:val="333333"/>
-                      <w:w w:val="95"/>
-                    </w:rPr>
-                    <w:t>what</w:t>
-                  </w:r>
-                  <w:r>
-                    <w:rPr>
-                      <w:color w:val="333333"/>
-                      <w:spacing w:val="2"/>
-                      <w:w w:val="95"/>
-                    </w:rPr>
-                    <w:t xml:space="preserve"> </w:t>
-                  </w:r>
-                  <w:r>
-                    <w:rPr>
-                      <w:color w:val="333333"/>
-                      <w:w w:val="95"/>
-                    </w:rPr>
-                    <w:t>is</w:t>
-                  </w:r>
-                  <w:r>
-                    <w:rPr>
-                      <w:color w:val="333333"/>
-                      <w:spacing w:val="4"/>
-                      <w:w w:val="95"/>
-                    </w:rPr>
-                    <w:t xml:space="preserve"> </w:t>
-                  </w:r>
-                  <w:r>
-                    <w:rPr>
-                      <w:color w:val="333333"/>
-                      <w:w w:val="95"/>
-                    </w:rPr>
-                    <w:t>the</w:t>
-                  </w:r>
-                  <w:r>
-                    <w:rPr>
-                      <w:color w:val="333333"/>
-                      <w:spacing w:val="3"/>
-                      <w:w w:val="95"/>
-                    </w:rPr>
-                    <w:t xml:space="preserve"> </w:t>
-                  </w:r>
-                  <w:r>
-                    <w:rPr>
-                      <w:color w:val="333333"/>
-                      <w:w w:val="95"/>
-                    </w:rPr>
-                    <w:t>value</w:t>
-                  </w:r>
-                  <w:r>
-                    <w:rPr>
-                      <w:color w:val="333333"/>
-                      <w:spacing w:val="1"/>
-                      <w:w w:val="95"/>
-                    </w:rPr>
-                    <w:t xml:space="preserve"> </w:t>
-                  </w:r>
-                  <w:r>
-                    <w:rPr>
-                      <w:color w:val="333333"/>
-                      <w:w w:val="95"/>
-                    </w:rPr>
-                    <w:t>of</w:t>
-                  </w:r>
-                  <w:r>
-                    <w:rPr>
-                      <w:color w:val="333333"/>
-                      <w:spacing w:val="2"/>
-                      <w:w w:val="95"/>
-                    </w:rPr>
-                    <w:t xml:space="preserve"> </w:t>
-                  </w:r>
-                  <w:r>
-                    <w:rPr>
-                      <w:color w:val="333333"/>
-                      <w:w w:val="95"/>
-                    </w:rPr>
-                    <w:t>SSE</w:t>
-                  </w:r>
-                  <w:r>
-                    <w:rPr>
-                      <w:color w:val="333333"/>
-                      <w:spacing w:val="3"/>
-                      <w:w w:val="95"/>
-                    </w:rPr>
-                    <w:t xml:space="preserve"> </w:t>
-                  </w:r>
-                  <w:r>
-                    <w:rPr>
-                      <w:color w:val="333333"/>
-                      <w:w w:val="95"/>
-                    </w:rPr>
-                    <w:t>?</w:t>
-                  </w:r>
-                </w:p>
-                <w:p>
-                  <w:pPr>
-                    <w:pStyle w:val="BodyText"/>
-                    <w:spacing w:before="9"/>
-                    <w:rPr>
-                      <w:sz w:val="21"/>
-                    </w:rPr>
-                  </w:pPr>
-                </w:p>
-                <w:p>
-                  <w:pPr>
-                    <w:pStyle w:val="BodyText"/>
-                    <w:numPr>
-                      <w:ilvl w:val="0"/>
-                      <w:numId w:val="8"/>
-                    </w:numPr>
-                    <w:tabs>
-                      <w:tab w:val="left" w:pos="183"/>
-                    </w:tabs>
-                    <w:ind w:left="182" w:hanging="184"/>
-                  </w:pPr>
-                  <w:r>
-                    <w:rPr>
-                      <w:color w:val="333333"/>
-                      <w:w w:val="95"/>
-                    </w:rPr>
-                    <w:t>Calculate</w:t>
-                  </w:r>
-                  <w:r>
-                    <w:rPr>
-                      <w:color w:val="333333"/>
-                      <w:spacing w:val="-9"/>
-                      <w:w w:val="95"/>
-                    </w:rPr>
-                    <w:t xml:space="preserve"> </w:t>
-                  </w:r>
-                  <w:r>
-                    <w:rPr>
-                      <w:color w:val="333333"/>
-                      <w:w w:val="95"/>
-                    </w:rPr>
-                    <w:t>the</w:t>
-                  </w:r>
-                  <w:r>
-                    <w:rPr>
-                      <w:color w:val="333333"/>
-                      <w:spacing w:val="-8"/>
-                      <w:w w:val="95"/>
-                    </w:rPr>
-                    <w:t xml:space="preserve"> </w:t>
-                  </w:r>
-                  <w:r>
-                    <w:rPr>
-                      <w:color w:val="333333"/>
-                      <w:w w:val="95"/>
-                    </w:rPr>
-                    <w:t>critical</w:t>
-                  </w:r>
-                  <w:r>
-                    <w:rPr>
-                      <w:color w:val="333333"/>
-                      <w:spacing w:val="-11"/>
-                      <w:w w:val="95"/>
-                    </w:rPr>
-                    <w:t xml:space="preserve"> </w:t>
-                  </w:r>
-                  <w:r>
-                    <w:rPr>
-                      <w:color w:val="333333"/>
-                      <w:w w:val="95"/>
-                    </w:rPr>
-                    <w:t>F</w:t>
-                  </w:r>
-                  <w:r>
-                    <w:rPr>
-                      <w:color w:val="333333"/>
-                      <w:spacing w:val="-6"/>
-                      <w:w w:val="95"/>
-                    </w:rPr>
-                    <w:t xml:space="preserve"> </w:t>
-                  </w:r>
-                  <w:r>
-                    <w:rPr>
-                      <w:color w:val="333333"/>
-                      <w:w w:val="95"/>
-                    </w:rPr>
-                    <w:t>value</w:t>
-                  </w:r>
-                  <w:r>
-                    <w:rPr>
-                      <w:color w:val="333333"/>
-                      <w:spacing w:val="-9"/>
-                      <w:w w:val="95"/>
-                    </w:rPr>
-                    <w:t xml:space="preserve"> </w:t>
-                  </w:r>
-                  <w:r>
-                    <w:rPr>
-                      <w:color w:val="333333"/>
-                      <w:w w:val="95"/>
-                    </w:rPr>
-                    <w:t>with</w:t>
-                  </w:r>
-                  <w:r>
-                    <w:rPr>
-                      <w:color w:val="333333"/>
-                      <w:spacing w:val="-8"/>
-                      <w:w w:val="95"/>
-                    </w:rPr>
-                    <w:t xml:space="preserve"> </w:t>
-                  </w:r>
-                  <w:r>
-                    <w:rPr>
-                      <w:color w:val="333333"/>
-                      <w:w w:val="95"/>
-                    </w:rPr>
-                    <w:t>8</w:t>
-                  </w:r>
-                  <w:r>
-                    <w:rPr>
-                      <w:color w:val="333333"/>
-                      <w:spacing w:val="-11"/>
-                      <w:w w:val="95"/>
-                    </w:rPr>
-                    <w:t xml:space="preserve"> </w:t>
-                  </w:r>
-                  <w:r>
-                    <w:rPr>
-                      <w:color w:val="333333"/>
-                      <w:w w:val="95"/>
-                    </w:rPr>
-                    <w:t>numerator</w:t>
-                  </w:r>
-                  <w:r>
-                    <w:rPr>
-                      <w:color w:val="333333"/>
-                      <w:spacing w:val="-8"/>
-                      <w:w w:val="95"/>
-                    </w:rPr>
-                    <w:t xml:space="preserve"> </w:t>
-                  </w:r>
-                  <w:r>
-                    <w:rPr>
-                      <w:color w:val="333333"/>
-                      <w:w w:val="95"/>
-                    </w:rPr>
-                    <w:t>and</w:t>
-                  </w:r>
-                  <w:r>
-                    <w:rPr>
-                      <w:color w:val="333333"/>
-                      <w:spacing w:val="-8"/>
-                      <w:w w:val="95"/>
-                    </w:rPr>
-                    <w:t xml:space="preserve"> </w:t>
-                  </w:r>
-                  <w:r>
-                    <w:rPr>
-                      <w:color w:val="333333"/>
-                      <w:w w:val="95"/>
-                    </w:rPr>
-                    <w:t>29</w:t>
-                  </w:r>
-                  <w:r>
-                    <w:rPr>
-                      <w:color w:val="333333"/>
-                      <w:spacing w:val="-7"/>
-                      <w:w w:val="95"/>
-                    </w:rPr>
-                    <w:t xml:space="preserve"> </w:t>
-                  </w:r>
-                  <w:r>
-                    <w:rPr>
-                      <w:color w:val="333333"/>
-                      <w:w w:val="95"/>
-                    </w:rPr>
-                    <w:t>denominator</w:t>
-                  </w:r>
-                  <w:r>
-                    <w:rPr>
-                      <w:color w:val="333333"/>
-                      <w:spacing w:val="-8"/>
-                      <w:w w:val="95"/>
-                    </w:rPr>
-                    <w:t xml:space="preserve"> </w:t>
-                  </w:r>
-                  <w:r>
-                    <w:rPr>
-                      <w:color w:val="333333"/>
-                      <w:w w:val="95"/>
-                    </w:rPr>
-                    <w:t>degrees</w:t>
-                  </w:r>
-                  <w:r>
-                    <w:rPr>
-                      <w:color w:val="333333"/>
-                      <w:spacing w:val="-9"/>
-                      <w:w w:val="95"/>
-                    </w:rPr>
-                    <w:t xml:space="preserve"> </w:t>
-                  </w:r>
-                  <w:r>
-                    <w:rPr>
-                      <w:color w:val="333333"/>
-                      <w:w w:val="95"/>
-                    </w:rPr>
-                    <w:t>of</w:t>
-                  </w:r>
-                  <w:r>
-                    <w:rPr>
-                      <w:color w:val="333333"/>
-                      <w:spacing w:val="-6"/>
-                      <w:w w:val="95"/>
-                    </w:rPr>
-                    <w:t xml:space="preserve"> </w:t>
-                  </w:r>
-                  <w:r>
-                    <w:rPr>
-                      <w:color w:val="333333"/>
-                      <w:w w:val="95"/>
-                    </w:rPr>
-                    <w:t>freedom</w:t>
-                  </w:r>
-                  <w:r>
-                    <w:rPr>
-                      <w:color w:val="333333"/>
-                      <w:spacing w:val="-7"/>
-                      <w:w w:val="95"/>
-                    </w:rPr>
-                    <w:t xml:space="preserve"> </w:t>
-                  </w:r>
-                  <w:r>
-                    <w:rPr>
-                      <w:color w:val="333333"/>
-                      <w:w w:val="95"/>
-                    </w:rPr>
-                    <w:t>at</w:t>
-                  </w:r>
-                  <w:r>
-                    <w:rPr>
-                      <w:color w:val="333333"/>
-                      <w:spacing w:val="-8"/>
-                      <w:w w:val="95"/>
-                    </w:rPr>
-                    <w:t xml:space="preserve"> </w:t>
-                  </w:r>
-                  <w:r>
-                    <w:rPr>
-                      <w:color w:val="333333"/>
-                      <w:w w:val="95"/>
-                    </w:rPr>
-                    <w:t>alpha</w:t>
-                  </w:r>
-                  <w:r>
-                    <w:rPr>
-                      <w:color w:val="333333"/>
-                      <w:spacing w:val="-7"/>
-                      <w:w w:val="95"/>
-                    </w:rPr>
-                    <w:t xml:space="preserve"> </w:t>
-                  </w:r>
-                  <w:r>
-                    <w:rPr>
-                      <w:color w:val="333333"/>
-                      <w:w w:val="95"/>
-                    </w:rPr>
-                    <w:t>=</w:t>
-                  </w:r>
-                  <w:r>
-                    <w:rPr>
-                      <w:color w:val="333333"/>
-                      <w:spacing w:val="-11"/>
-                      <w:w w:val="95"/>
-                    </w:rPr>
-                    <w:t xml:space="preserve"> </w:t>
-                  </w:r>
-                  <w:r>
-                    <w:rPr>
-                      <w:color w:val="333333"/>
-                      <w:w w:val="95"/>
-                    </w:rPr>
-                    <w:t>0.01</w:t>
-                  </w:r>
-                  <w:r>
-                    <w:rPr>
-                      <w:color w:val="333333"/>
-                      <w:spacing w:val="-8"/>
-                      <w:w w:val="95"/>
-                    </w:rPr>
-                    <w:t xml:space="preserve"> </w:t>
-                  </w:r>
-                  <w:r>
-                    <w:rPr>
-                      <w:color w:val="333333"/>
-                      <w:w w:val="95"/>
-                    </w:rPr>
-                    <w:t>.</w:t>
-                  </w:r>
-                </w:p>
-              </w:txbxContent>
-            </v:textbox>
-            <w10:wrap type="topAndBottom" anchorx="page"/>
-          </v:shape>
-        </w:pict>
-      </w:r>
-    </w:p>
-    <w:p>
-      <w:pPr>
-        <w:sectPr>
-          <w:pgSz w:w="12240" w:h="15840"/>
-          <w:pgMar w:top="1500" w:right="160" w:bottom="280" w:left="1300" w:header="720" w:footer="720" w:gutter="0"/>
-          <w:cols w:space="720"/>
-        </w:sectPr>
-      </w:pPr>
+        <w:numPr>
+          <w:ilvl w:val="0"/>
+          <w:numId w:val="9"/>
+        </w:numPr>
+        <w:tabs>
+          <w:tab w:val="left" w:pos="238"/>
+        </w:tabs>
+        <w:spacing w:line="250" w:lineRule="exact"/>
+      </w:pPr>
+      <w:r>
+        <w:rPr>
+          <w:color w:val="333333"/>
+          <w:w w:val="95"/>
+        </w:rPr>
+        <w:t>In</w:t>
+      </w:r>
+      <w:r>
+        <w:rPr>
+          <w:color w:val="333333"/>
+          <w:spacing w:val="1"/>
+          <w:w w:val="95"/>
+        </w:rPr>
+        <w:t xml:space="preserve"> </w:t>
+      </w:r>
+      <w:r>
+        <w:rPr>
+          <w:color w:val="333333"/>
+          <w:w w:val="95"/>
+        </w:rPr>
+        <w:t>an</w:t>
+      </w:r>
+      <w:r>
+        <w:rPr>
+          <w:color w:val="333333"/>
+          <w:spacing w:val="3"/>
+          <w:w w:val="95"/>
+        </w:rPr>
+        <w:t xml:space="preserve"> </w:t>
+      </w:r>
+      <w:r>
+        <w:rPr>
+          <w:color w:val="333333"/>
+          <w:w w:val="95"/>
+        </w:rPr>
+        <w:t>ANOVA</w:t>
+      </w:r>
+      <w:r>
+        <w:rPr>
+          <w:color w:val="333333"/>
+          <w:spacing w:val="2"/>
+          <w:w w:val="95"/>
+        </w:rPr>
+        <w:t xml:space="preserve"> </w:t>
+      </w:r>
+      <w:r>
+        <w:rPr>
+          <w:color w:val="333333"/>
+          <w:w w:val="95"/>
+        </w:rPr>
+        <w:t>problem</w:t>
+      </w:r>
+      <w:r>
+        <w:rPr>
+          <w:color w:val="333333"/>
+          <w:spacing w:val="2"/>
+          <w:w w:val="95"/>
+        </w:rPr>
+        <w:t xml:space="preserve"> </w:t>
+      </w:r>
+      <w:r>
+        <w:rPr>
+          <w:color w:val="333333"/>
+          <w:w w:val="95"/>
+        </w:rPr>
+        <w:t>if</w:t>
+      </w:r>
+      <w:r>
+        <w:rPr>
+          <w:color w:val="333333"/>
+          <w:spacing w:val="2"/>
+          <w:w w:val="95"/>
+        </w:rPr>
+        <w:t xml:space="preserve"> </w:t>
+      </w:r>
+      <w:r>
+        <w:rPr>
+          <w:color w:val="333333"/>
+          <w:w w:val="95"/>
+        </w:rPr>
+        <w:t>SST</w:t>
+      </w:r>
+      <w:r>
+        <w:rPr>
+          <w:color w:val="333333"/>
+          <w:spacing w:val="3"/>
+          <w:w w:val="95"/>
+        </w:rPr>
+        <w:t xml:space="preserve"> </w:t>
+      </w:r>
+      <w:r>
+        <w:rPr>
+          <w:color w:val="333333"/>
+          <w:w w:val="95"/>
+        </w:rPr>
+        <w:t>=</w:t>
+      </w:r>
+      <w:r>
+        <w:rPr>
+          <w:color w:val="333333"/>
+          <w:spacing w:val="1"/>
+          <w:w w:val="95"/>
+        </w:rPr>
+        <w:t xml:space="preserve"> </w:t>
+      </w:r>
+      <w:r>
+        <w:rPr>
+          <w:color w:val="333333"/>
+          <w:w w:val="95"/>
+        </w:rPr>
+        <w:t>120</w:t>
+      </w:r>
+      <w:r>
+        <w:rPr>
+          <w:color w:val="333333"/>
+          <w:spacing w:val="1"/>
+          <w:w w:val="95"/>
+        </w:rPr>
+        <w:t xml:space="preserve"> </w:t>
+      </w:r>
+      <w:r>
+        <w:rPr>
+          <w:color w:val="333333"/>
+          <w:w w:val="95"/>
+        </w:rPr>
+        <w:t>and</w:t>
+      </w:r>
+      <w:r>
+        <w:rPr>
+          <w:color w:val="333333"/>
+          <w:spacing w:val="1"/>
+          <w:w w:val="95"/>
+        </w:rPr>
+        <w:t xml:space="preserve"> </w:t>
+      </w:r>
+      <w:r>
+        <w:rPr>
+          <w:color w:val="333333"/>
+          <w:w w:val="95"/>
+        </w:rPr>
+        <w:t>SSTR</w:t>
+      </w:r>
+      <w:r>
+        <w:rPr>
+          <w:color w:val="333333"/>
+          <w:spacing w:val="2"/>
+          <w:w w:val="95"/>
+        </w:rPr>
+        <w:t xml:space="preserve"> </w:t>
+      </w:r>
+      <w:r>
+        <w:rPr>
+          <w:color w:val="333333"/>
+          <w:w w:val="95"/>
+        </w:rPr>
+        <w:t>=</w:t>
+      </w:r>
+      <w:r>
+        <w:rPr>
+          <w:color w:val="333333"/>
+          <w:spacing w:val="1"/>
+          <w:w w:val="95"/>
+        </w:rPr>
+        <w:t xml:space="preserve"> </w:t>
+      </w:r>
+      <w:r>
+        <w:rPr>
+          <w:color w:val="333333"/>
+          <w:w w:val="95"/>
+        </w:rPr>
+        <w:t>80,</w:t>
+      </w:r>
+      <w:r>
+        <w:rPr>
+          <w:color w:val="333333"/>
+          <w:spacing w:val="1"/>
+          <w:w w:val="95"/>
+        </w:rPr>
+        <w:t xml:space="preserve"> </w:t>
+      </w:r>
+      <w:r>
+        <w:rPr>
+          <w:color w:val="333333"/>
+          <w:w w:val="95"/>
+        </w:rPr>
+        <w:t>what</w:t>
+      </w:r>
+      <w:r>
+        <w:rPr>
+          <w:color w:val="333333"/>
+          <w:spacing w:val="2"/>
+          <w:w w:val="95"/>
+        </w:rPr>
+        <w:t xml:space="preserve"> </w:t>
+      </w:r>
+      <w:r>
+        <w:rPr>
+          <w:color w:val="333333"/>
+          <w:w w:val="95"/>
+        </w:rPr>
+        <w:t>is</w:t>
+      </w:r>
+      <w:r>
+        <w:rPr>
+          <w:color w:val="333333"/>
+          <w:spacing w:val="4"/>
+          <w:w w:val="95"/>
+        </w:rPr>
+        <w:t xml:space="preserve"> </w:t>
+      </w:r>
+      <w:r>
+        <w:rPr>
+          <w:color w:val="333333"/>
+          <w:w w:val="95"/>
+        </w:rPr>
+        <w:t>the</w:t>
+      </w:r>
+      <w:r>
+        <w:rPr>
+          <w:color w:val="333333"/>
+          <w:spacing w:val="3"/>
+          <w:w w:val="95"/>
+        </w:rPr>
+        <w:t xml:space="preserve"> </w:t>
+      </w:r>
+      <w:r>
+        <w:rPr>
+          <w:color w:val="333333"/>
+          <w:w w:val="95"/>
+        </w:rPr>
+        <w:t>value</w:t>
+      </w:r>
+      <w:r>
+        <w:rPr>
+          <w:color w:val="333333"/>
+          <w:spacing w:val="1"/>
+          <w:w w:val="95"/>
+        </w:rPr>
+        <w:t xml:space="preserve"> </w:t>
+      </w:r>
+      <w:r>
+        <w:rPr>
+          <w:color w:val="333333"/>
+          <w:w w:val="95"/>
+        </w:rPr>
+        <w:t>of</w:t>
+      </w:r>
+      <w:r>
+        <w:rPr>
+          <w:color w:val="333333"/>
+          <w:spacing w:val="2"/>
+          <w:w w:val="95"/>
+        </w:rPr>
+        <w:t xml:space="preserve"> </w:t>
+      </w:r>
+      <w:r>
+        <w:rPr>
+          <w:color w:val="333333"/>
+          <w:w w:val="95"/>
+        </w:rPr>
+        <w:t>SSE</w:t>
+      </w:r>
+      <w:r>
+        <w:rPr>
+          <w:color w:val="333333"/>
+          <w:spacing w:val="3"/>
+          <w:w w:val="95"/>
+        </w:rPr>
+        <w:t xml:space="preserve"> </w:t>
+      </w:r>
+      <w:r>
+        <w:rPr>
+          <w:color w:val="333333"/>
+          <w:w w:val="95"/>
+        </w:rPr>
+        <w:t>?</w:t>
+      </w:r>
+    </w:p>
+    <w:p>
+      <w:pPr>
+        <w:pStyle w:val="ListParagraph"/>
+      </w:pPr>
+    </w:p>
+    <w:p>
+      <w:pPr>
+        <w:pStyle w:val="BodyText"/>
+        <w:spacing w:before="9"/>
+        <w:rPr>
+          <w:sz w:val="21"/>
+        </w:rPr>
+      </w:pPr>
+    </w:p>
+    <w:p>
+      <w:pPr>
+        <w:pStyle w:val="BodyText"/>
+        <w:numPr>
+          <w:ilvl w:val="0"/>
+          <w:numId w:val="9"/>
+        </w:numPr>
+        <w:tabs>
+          <w:tab w:val="left" w:pos="183"/>
+        </w:tabs>
+      </w:pPr>
+      <w:r>
+        <w:rPr>
+          <w:color w:val="333333"/>
+          <w:w w:val="95"/>
+        </w:rPr>
+        <w:t>Calculate</w:t>
+      </w:r>
+      <w:r>
+        <w:rPr>
+          <w:color w:val="333333"/>
+          <w:spacing w:val="-9"/>
+          <w:w w:val="95"/>
+        </w:rPr>
+        <w:t xml:space="preserve"> </w:t>
+      </w:r>
+      <w:r>
+        <w:rPr>
+          <w:color w:val="333333"/>
+          <w:w w:val="95"/>
+        </w:rPr>
+        <w:t>the</w:t>
+      </w:r>
+      <w:r>
+        <w:rPr>
+          <w:color w:val="333333"/>
+          <w:spacing w:val="-8"/>
+          <w:w w:val="95"/>
+        </w:rPr>
+        <w:t xml:space="preserve"> </w:t>
+      </w:r>
+      <w:r>
+        <w:rPr>
+          <w:color w:val="333333"/>
+          <w:w w:val="95"/>
+        </w:rPr>
+        <w:t>critical</w:t>
+      </w:r>
+      <w:r>
+        <w:rPr>
+          <w:color w:val="333333"/>
+          <w:spacing w:val="-11"/>
+          <w:w w:val="95"/>
+        </w:rPr>
+        <w:t xml:space="preserve"> </w:t>
+      </w:r>
+      <w:r>
+        <w:rPr>
+          <w:color w:val="333333"/>
+          <w:w w:val="95"/>
+        </w:rPr>
+        <w:t>F</w:t>
+      </w:r>
+      <w:r>
+        <w:rPr>
+          <w:color w:val="333333"/>
+          <w:spacing w:val="-6"/>
+          <w:w w:val="95"/>
+        </w:rPr>
+        <w:t xml:space="preserve"> </w:t>
+      </w:r>
+      <w:r>
+        <w:rPr>
+          <w:color w:val="333333"/>
+          <w:w w:val="95"/>
+        </w:rPr>
+        <w:t>value</w:t>
+      </w:r>
+      <w:r>
+        <w:rPr>
+          <w:color w:val="333333"/>
+          <w:spacing w:val="-9"/>
+          <w:w w:val="95"/>
+        </w:rPr>
+        <w:t xml:space="preserve"> </w:t>
+      </w:r>
+      <w:r>
+        <w:rPr>
+          <w:color w:val="333333"/>
+          <w:w w:val="95"/>
+        </w:rPr>
+        <w:t>with</w:t>
+      </w:r>
+      <w:r>
+        <w:rPr>
+          <w:color w:val="333333"/>
+          <w:spacing w:val="-8"/>
+          <w:w w:val="95"/>
+        </w:rPr>
+        <w:t xml:space="preserve"> </w:t>
+      </w:r>
+      <w:r>
+        <w:rPr>
+          <w:color w:val="333333"/>
+          <w:w w:val="95"/>
+        </w:rPr>
+        <w:t>8</w:t>
+      </w:r>
+      <w:r>
+        <w:rPr>
+          <w:color w:val="333333"/>
+          <w:spacing w:val="-11"/>
+          <w:w w:val="95"/>
+        </w:rPr>
+        <w:t xml:space="preserve"> </w:t>
+      </w:r>
+      <w:r>
+        <w:rPr>
+          <w:color w:val="333333"/>
+          <w:w w:val="95"/>
+        </w:rPr>
+        <w:t>numerator</w:t>
+      </w:r>
+      <w:r>
+        <w:rPr>
+          <w:color w:val="333333"/>
+          <w:spacing w:val="-8"/>
+          <w:w w:val="95"/>
+        </w:rPr>
+        <w:t xml:space="preserve"> </w:t>
+      </w:r>
+      <w:r>
+        <w:rPr>
+          <w:color w:val="333333"/>
+          <w:w w:val="95"/>
+        </w:rPr>
+        <w:t>and</w:t>
+      </w:r>
+      <w:r>
+        <w:rPr>
+          <w:color w:val="333333"/>
+          <w:spacing w:val="-8"/>
+          <w:w w:val="95"/>
+        </w:rPr>
+        <w:t xml:space="preserve"> </w:t>
+      </w:r>
+      <w:r>
+        <w:rPr>
+          <w:color w:val="333333"/>
+          <w:w w:val="95"/>
+        </w:rPr>
+        <w:t>29</w:t>
+      </w:r>
+      <w:r>
+        <w:rPr>
+          <w:color w:val="333333"/>
+          <w:spacing w:val="-7"/>
+          <w:w w:val="95"/>
+        </w:rPr>
+        <w:t xml:space="preserve"> </w:t>
+      </w:r>
+      <w:r>
+        <w:rPr>
+          <w:color w:val="333333"/>
+          <w:w w:val="95"/>
+        </w:rPr>
+        <w:t>denominator</w:t>
+      </w:r>
+      <w:r>
+        <w:rPr>
+          <w:color w:val="333333"/>
+          <w:spacing w:val="-8"/>
+          <w:w w:val="95"/>
+        </w:rPr>
+        <w:t xml:space="preserve"> </w:t>
+      </w:r>
+      <w:r>
+        <w:rPr>
+          <w:color w:val="333333"/>
+          <w:w w:val="95"/>
+        </w:rPr>
+        <w:t>degrees</w:t>
+      </w:r>
+      <w:r>
+        <w:rPr>
+          <w:color w:val="333333"/>
+          <w:spacing w:val="-9"/>
+          <w:w w:val="95"/>
+        </w:rPr>
+        <w:t xml:space="preserve"> </w:t>
+      </w:r>
+      <w:r>
+        <w:rPr>
+          <w:color w:val="333333"/>
+          <w:w w:val="95"/>
+        </w:rPr>
+        <w:t>of</w:t>
+      </w:r>
+      <w:r>
+        <w:rPr>
+          <w:color w:val="333333"/>
+          <w:spacing w:val="-6"/>
+          <w:w w:val="95"/>
+        </w:rPr>
+        <w:t xml:space="preserve"> </w:t>
+      </w:r>
+      <w:r>
+        <w:rPr>
+          <w:color w:val="333333"/>
+          <w:w w:val="95"/>
+        </w:rPr>
+        <w:t>freedom</w:t>
+      </w:r>
+      <w:r>
+        <w:rPr>
+          <w:color w:val="333333"/>
+          <w:spacing w:val="-7"/>
+          <w:w w:val="95"/>
+        </w:rPr>
+        <w:t xml:space="preserve"> </w:t>
+      </w:r>
+      <w:r>
+        <w:rPr>
+          <w:color w:val="333333"/>
+          <w:w w:val="95"/>
+        </w:rPr>
+        <w:t>at</w:t>
+      </w:r>
+      <w:r>
+        <w:rPr>
+          <w:color w:val="333333"/>
+          <w:spacing w:val="-8"/>
+          <w:w w:val="95"/>
+        </w:rPr>
+        <w:t xml:space="preserve"> </w:t>
+      </w:r>
+      <w:r>
+        <w:rPr>
+          <w:color w:val="333333"/>
+          <w:w w:val="95"/>
+        </w:rPr>
+        <w:t>alpha</w:t>
+      </w:r>
+      <w:r>
+        <w:rPr>
+          <w:color w:val="333333"/>
+          <w:spacing w:val="-7"/>
+          <w:w w:val="95"/>
+        </w:rPr>
+        <w:t xml:space="preserve"> </w:t>
+      </w:r>
+      <w:r>
+        <w:rPr>
+          <w:color w:val="333333"/>
+          <w:w w:val="95"/>
+        </w:rPr>
+        <w:t>=</w:t>
+      </w:r>
+      <w:r>
+        <w:rPr>
+          <w:color w:val="333333"/>
+          <w:spacing w:val="-11"/>
+          <w:w w:val="95"/>
+        </w:rPr>
+        <w:t xml:space="preserve"> </w:t>
+      </w:r>
+      <w:r>
+        <w:rPr>
+          <w:color w:val="333333"/>
+          <w:w w:val="95"/>
+        </w:rPr>
+        <w:t>0.01.</w:t>
+      </w:r>
+    </w:p>
+    <w:p>
+      <w:pPr>
+        <w:pStyle w:val="BodyText"/>
+        <w:numPr>
+          <w:ilvl w:val="0"/>
+          <w:numId w:val="9"/>
+        </w:numPr>
+        <w:tabs>
+          <w:tab w:val="left" w:pos="183"/>
+        </w:tabs>
+      </w:pPr>
+      <w:r>
+        <w:t>Mean marks obtained by male and female students of schools ABCD in the first unit test are shown below.</w:t>
+      </w:r>
     </w:p>
     <w:tbl>
       <w:tblPr>
+        <w:tblStyle w:val="TableGrid"/>
+        <w:tblpPr w:leftFromText="180" w:rightFromText="180" w:vertAnchor="text" w:horzAnchor="margin" w:tblpY="30"/>
         <w:tblW w:w="0" w:type="auto"/>
-        <w:tblInd w:w="147" w:type="dxa"/>
-        <w:tblLayout w:type="fixed"/>
-        <w:tblCellMar>
-          <w:left w:w="0" w:type="dxa"/>
-          <w:right w:w="0" w:type="dxa"/>
-        </w:tblCellMar>
         <w:tblLook w:val="01E0" w:firstRow="1" w:lastRow="1" w:firstColumn="1" w:lastColumn="1" w:noHBand="0" w:noVBand="0"/>
       </w:tblPr>
       <w:tblGrid>
-        <w:gridCol w:w="2850"/>
-        <w:gridCol w:w="2162"/>
-        <w:gridCol w:w="4349"/>
+        <w:gridCol w:w="2494"/>
+        <w:gridCol w:w="832"/>
+        <w:gridCol w:w="1040"/>
       </w:tblGrid>
-      <w:tr>
-        <w:trPr>
-          <w:trHeight w:val="295"/>
-        </w:trPr>
-        <w:tc>
-          <w:tcPr>
-            <w:tcW w:w="9361" w:type="dxa"/>
-            <w:gridSpan w:val="3"/>
-            <w:shd w:val="clear" w:color="auto" w:fill="F8F8F8"/>
-          </w:tcPr>
-          <w:p>
-            <w:pPr>
-              <w:pStyle w:val="TableParagraph"/>
-              <w:spacing w:line="249" w:lineRule="exact"/>
-              <w:rPr>
-                <w:b/>
-              </w:rPr>
-            </w:pPr>
-            <w:r>
-              <w:rPr>
-                <w:b/>
-                <w:color w:val="333333"/>
-                <w:w w:val="95"/>
-              </w:rPr>
-              <w:lastRenderedPageBreak/>
-              <w:t>7)</w:t>
-            </w:r>
-            <w:r>
-              <w:rPr>
-                <w:b/>
-                <w:color w:val="333333"/>
-                <w:spacing w:val="-6"/>
-                <w:w w:val="95"/>
-              </w:rPr>
-              <w:t xml:space="preserve"> </w:t>
-            </w:r>
-            <w:r>
-              <w:rPr>
-                <w:b/>
-                <w:color w:val="333333"/>
-                <w:w w:val="95"/>
-              </w:rPr>
-              <w:t>Mean</w:t>
-            </w:r>
-            <w:r>
-              <w:rPr>
-                <w:b/>
-                <w:color w:val="333333"/>
-                <w:spacing w:val="-4"/>
-                <w:w w:val="95"/>
-              </w:rPr>
-              <w:t xml:space="preserve"> </w:t>
-            </w:r>
-            <w:r>
-              <w:rPr>
-                <w:b/>
-                <w:color w:val="333333"/>
-                <w:w w:val="95"/>
-              </w:rPr>
-              <w:t>marks</w:t>
-            </w:r>
-            <w:r>
-              <w:rPr>
-                <w:b/>
-                <w:color w:val="333333"/>
-                <w:spacing w:val="-8"/>
-                <w:w w:val="95"/>
-              </w:rPr>
-              <w:t xml:space="preserve"> </w:t>
-            </w:r>
-            <w:r>
-              <w:rPr>
-                <w:b/>
-                <w:color w:val="333333"/>
-                <w:w w:val="95"/>
-              </w:rPr>
-              <w:t>obtained</w:t>
-            </w:r>
-            <w:r>
-              <w:rPr>
-                <w:b/>
-                <w:color w:val="333333"/>
-                <w:spacing w:val="-4"/>
-                <w:w w:val="95"/>
-              </w:rPr>
-              <w:t xml:space="preserve"> </w:t>
-            </w:r>
-            <w:r>
-              <w:rPr>
-                <w:b/>
-                <w:color w:val="333333"/>
-                <w:w w:val="95"/>
-              </w:rPr>
-              <w:t>by</w:t>
-            </w:r>
-            <w:r>
-              <w:rPr>
-                <w:b/>
-                <w:color w:val="333333"/>
-                <w:spacing w:val="-4"/>
-                <w:w w:val="95"/>
-              </w:rPr>
-              <w:t xml:space="preserve"> </w:t>
-            </w:r>
-            <w:r>
-              <w:rPr>
-                <w:b/>
-                <w:color w:val="333333"/>
-                <w:w w:val="95"/>
-              </w:rPr>
-              <w:t>male</w:t>
-            </w:r>
-            <w:r>
-              <w:rPr>
-                <w:b/>
-                <w:color w:val="333333"/>
-                <w:spacing w:val="-6"/>
-                <w:w w:val="95"/>
-              </w:rPr>
-              <w:t xml:space="preserve"> </w:t>
-            </w:r>
-            <w:r>
-              <w:rPr>
-                <w:b/>
-                <w:color w:val="333333"/>
-                <w:w w:val="95"/>
-              </w:rPr>
-              <w:t>and</w:t>
-            </w:r>
-            <w:r>
-              <w:rPr>
-                <w:b/>
-                <w:color w:val="333333"/>
-                <w:spacing w:val="-6"/>
-                <w:w w:val="95"/>
-              </w:rPr>
-              <w:t xml:space="preserve"> </w:t>
-            </w:r>
-            <w:r>
-              <w:rPr>
-                <w:b/>
-                <w:color w:val="333333"/>
-                <w:w w:val="95"/>
-              </w:rPr>
-              <w:t>female</w:t>
-            </w:r>
-            <w:r>
-              <w:rPr>
-                <w:b/>
-                <w:color w:val="333333"/>
-                <w:spacing w:val="-5"/>
-                <w:w w:val="95"/>
-              </w:rPr>
-              <w:t xml:space="preserve"> </w:t>
-            </w:r>
-            <w:r>
-              <w:rPr>
-                <w:b/>
-                <w:color w:val="333333"/>
-                <w:w w:val="95"/>
-              </w:rPr>
-              <w:t>students</w:t>
-            </w:r>
-            <w:r>
-              <w:rPr>
-                <w:b/>
-                <w:color w:val="333333"/>
-                <w:spacing w:val="-6"/>
-                <w:w w:val="95"/>
-              </w:rPr>
-              <w:t xml:space="preserve"> </w:t>
-            </w:r>
-            <w:r>
-              <w:rPr>
-                <w:b/>
-                <w:color w:val="333333"/>
-                <w:w w:val="95"/>
-              </w:rPr>
-              <w:t>of</w:t>
-            </w:r>
-            <w:r>
-              <w:rPr>
-                <w:b/>
-                <w:color w:val="333333"/>
-                <w:spacing w:val="-5"/>
-                <w:w w:val="95"/>
-              </w:rPr>
-              <w:t xml:space="preserve"> </w:t>
-            </w:r>
-            <w:r>
-              <w:rPr>
-                <w:b/>
-                <w:color w:val="333333"/>
-                <w:w w:val="95"/>
-              </w:rPr>
-              <w:t>schools</w:t>
-            </w:r>
-            <w:r>
-              <w:rPr>
-                <w:b/>
-                <w:color w:val="333333"/>
-                <w:spacing w:val="-6"/>
-                <w:w w:val="95"/>
-              </w:rPr>
-              <w:t xml:space="preserve"> </w:t>
-            </w:r>
-            <w:r>
-              <w:rPr>
-                <w:b/>
-                <w:color w:val="333333"/>
-                <w:w w:val="95"/>
-              </w:rPr>
-              <w:t>ABCD</w:t>
-            </w:r>
-            <w:r>
-              <w:rPr>
-                <w:b/>
-                <w:color w:val="333333"/>
-                <w:spacing w:val="-5"/>
-                <w:w w:val="95"/>
-              </w:rPr>
-              <w:t xml:space="preserve"> </w:t>
-            </w:r>
-            <w:r>
-              <w:rPr>
-                <w:b/>
-                <w:color w:val="333333"/>
-                <w:w w:val="95"/>
-              </w:rPr>
-              <w:t>in</w:t>
-            </w:r>
-            <w:r>
-              <w:rPr>
-                <w:b/>
-                <w:color w:val="333333"/>
-                <w:spacing w:val="-6"/>
-                <w:w w:val="95"/>
-              </w:rPr>
-              <w:t xml:space="preserve"> </w:t>
-            </w:r>
-            <w:r>
-              <w:rPr>
-                <w:b/>
-                <w:color w:val="333333"/>
-                <w:w w:val="95"/>
-              </w:rPr>
-              <w:t>the</w:t>
-            </w:r>
-            <w:r>
-              <w:rPr>
-                <w:b/>
-                <w:color w:val="333333"/>
-                <w:spacing w:val="-6"/>
-                <w:w w:val="95"/>
-              </w:rPr>
-              <w:t xml:space="preserve"> </w:t>
-            </w:r>
-            <w:r>
-              <w:rPr>
-                <w:b/>
-                <w:color w:val="333333"/>
-                <w:w w:val="95"/>
-              </w:rPr>
-              <w:t>first</w:t>
-            </w:r>
-            <w:r>
-              <w:rPr>
-                <w:b/>
-                <w:color w:val="333333"/>
-                <w:spacing w:val="-8"/>
-                <w:w w:val="95"/>
-              </w:rPr>
-              <w:t xml:space="preserve"> </w:t>
-            </w:r>
-            <w:r>
-              <w:rPr>
-                <w:b/>
-                <w:color w:val="333333"/>
-                <w:w w:val="95"/>
-              </w:rPr>
-              <w:t>unit</w:t>
-            </w:r>
-            <w:r>
-              <w:rPr>
-                <w:b/>
-                <w:color w:val="333333"/>
-                <w:spacing w:val="-5"/>
-                <w:w w:val="95"/>
-              </w:rPr>
-              <w:t xml:space="preserve"> </w:t>
-            </w:r>
-            <w:r>
-              <w:rPr>
-                <w:b/>
-                <w:color w:val="333333"/>
-                <w:w w:val="95"/>
-              </w:rPr>
-              <w:t>test</w:t>
-            </w:r>
-            <w:r>
-              <w:rPr>
-                <w:b/>
-                <w:color w:val="333333"/>
-                <w:spacing w:val="-5"/>
-                <w:w w:val="95"/>
-              </w:rPr>
-              <w:t xml:space="preserve"> </w:t>
-            </w:r>
-            <w:r>
-              <w:rPr>
-                <w:b/>
-                <w:color w:val="333333"/>
-                <w:w w:val="95"/>
-              </w:rPr>
-              <w:t>are</w:t>
-            </w:r>
-            <w:r>
-              <w:rPr>
-                <w:b/>
-                <w:color w:val="333333"/>
-                <w:spacing w:val="-6"/>
-                <w:w w:val="95"/>
-              </w:rPr>
-              <w:t xml:space="preserve"> </w:t>
-            </w:r>
-            <w:r>
-              <w:rPr>
-                <w:b/>
-                <w:color w:val="333333"/>
-                <w:w w:val="95"/>
-              </w:rPr>
-              <w:t>shown</w:t>
-            </w:r>
-          </w:p>
-        </w:tc>
-      </w:tr>
-      <w:tr>
-        <w:trPr>
-          <w:trHeight w:val="512"/>
-        </w:trPr>
-        <w:tc>
-          <w:tcPr>
-            <w:tcW w:w="2850" w:type="dxa"/>
-            <w:shd w:val="clear" w:color="auto" w:fill="F8F8F8"/>
-          </w:tcPr>
-          <w:p>
-            <w:pPr>
-              <w:pStyle w:val="TableParagraph"/>
-              <w:spacing w:before="6"/>
-              <w:rPr>
-                <w:b/>
-              </w:rPr>
-            </w:pPr>
-            <w:r>
-              <w:rPr>
-                <w:b/>
-                <w:color w:val="333333"/>
-              </w:rPr>
-              <w:t>below.</w:t>
-            </w:r>
-          </w:p>
-        </w:tc>
-        <w:tc>
-          <w:tcPr>
-            <w:tcW w:w="2162" w:type="dxa"/>
-            <w:shd w:val="clear" w:color="auto" w:fill="F8F8F8"/>
-          </w:tcPr>
-          <w:p>
-            <w:pPr>
-              <w:pStyle w:val="TableParagraph"/>
-              <w:ind w:left="0"/>
-            </w:pPr>
-          </w:p>
-        </w:tc>
-        <w:tc>
-          <w:tcPr>
-            <w:tcW w:w="4349" w:type="dxa"/>
-            <w:shd w:val="clear" w:color="auto" w:fill="F8F8F8"/>
-          </w:tcPr>
-          <w:p>
-            <w:pPr>
-              <w:pStyle w:val="TableParagraph"/>
-              <w:ind w:left="0"/>
-            </w:pPr>
-          </w:p>
-        </w:tc>
-      </w:tr>
       <w:tr>
         <w:trPr>
           <w:trHeight w:val="276"/>
         </w:trPr>
         <w:tc>
           <w:tcPr>
-            <w:tcW w:w="2850" w:type="dxa"/>
+            <w:tcW w:w="0" w:type="auto"/>
           </w:tcPr>
           <w:p>
             <w:pPr>
-              <w:pStyle w:val="TableParagraph"/>
-              <w:ind w:left="0"/>
-              <w:rPr>
-                <w:sz w:val="20"/>
-              </w:rPr>
+              <w:pStyle w:val="BodyText"/>
+              <w:tabs>
+                <w:tab w:val="left" w:pos="183"/>
+              </w:tabs>
+              <w:ind w:left="139"/>
             </w:pPr>
           </w:p>
         </w:tc>
         <w:tc>
           <w:tcPr>
-            <w:tcW w:w="2162" w:type="dxa"/>
+            <w:tcW w:w="0" w:type="auto"/>
           </w:tcPr>
           <w:p>
             <w:pPr>
-              <w:pStyle w:val="TableParagraph"/>
-              <w:spacing w:line="250" w:lineRule="exact"/>
-              <w:ind w:left="814" w:right="831"/>
-              <w:jc w:val="center"/>
-              <w:rPr>
-                <w:b/>
-              </w:rPr>
+              <w:pStyle w:val="BodyText"/>
+              <w:tabs>
+                <w:tab w:val="left" w:pos="183"/>
+              </w:tabs>
+              <w:ind w:left="139"/>
             </w:pPr>
             <w:r>
-              <w:rPr>
-                <w:b/>
-              </w:rPr>
               <w:t>Male</w:t>
             </w:r>
           </w:p>
         </w:tc>
         <w:tc>
           <w:tcPr>
-            <w:tcW w:w="4349" w:type="dxa"/>
+            <w:tcW w:w="0" w:type="auto"/>
           </w:tcPr>
           <w:p>
             <w:pPr>
-              <w:pStyle w:val="TableParagraph"/>
-              <w:spacing w:line="250" w:lineRule="exact"/>
-              <w:ind w:left="0" w:right="3080"/>
-              <w:jc w:val="right"/>
-              <w:rPr>
-                <w:b/>
-              </w:rPr>
+              <w:pStyle w:val="BodyText"/>
+              <w:tabs>
+                <w:tab w:val="left" w:pos="183"/>
+              </w:tabs>
+              <w:ind w:left="139"/>
             </w:pPr>
             <w:r>
-              <w:rPr>
-                <w:b/>
-              </w:rPr>
               <w:t>Female</w:t>
             </w:r>
           </w:p>
@@ -19418,79 +19062,51 @@
         </w:trPr>
         <w:tc>
           <w:tcPr>
-            <w:tcW w:w="2850" w:type="dxa"/>
+            <w:tcW w:w="0" w:type="auto"/>
           </w:tcPr>
           <w:p>
             <w:pPr>
-              <w:pStyle w:val="TableParagraph"/>
-              <w:spacing w:line="240" w:lineRule="exact"/>
-              <w:rPr>
-                <w:b/>
-              </w:rPr>
+              <w:pStyle w:val="BodyText"/>
+              <w:tabs>
+                <w:tab w:val="left" w:pos="183"/>
+              </w:tabs>
+              <w:ind w:left="139"/>
             </w:pPr>
             <w:r>
-              <w:rPr>
-                <w:b/>
-                <w:w w:val="95"/>
-              </w:rPr>
-              <w:t>Sample</w:t>
-            </w:r>
-            <w:r>
-              <w:rPr>
-                <w:b/>
-                <w:spacing w:val="8"/>
-                <w:w w:val="95"/>
-              </w:rPr>
-              <w:t xml:space="preserve"> </w:t>
-            </w:r>
-            <w:r>
-              <w:rPr>
-                <w:b/>
-                <w:w w:val="95"/>
-              </w:rPr>
-              <w:t>Size</w:t>
+              <w:t>Sample Size</w:t>
             </w:r>
           </w:p>
         </w:tc>
         <w:tc>
           <w:tcPr>
-            <w:tcW w:w="2162" w:type="dxa"/>
+            <w:tcW w:w="0" w:type="auto"/>
           </w:tcPr>
           <w:p>
             <w:pPr>
-              <w:pStyle w:val="TableParagraph"/>
-              <w:spacing w:line="240" w:lineRule="exact"/>
-              <w:ind w:left="760" w:right="831"/>
-              <w:jc w:val="center"/>
-              <w:rPr>
-                <w:b/>
-              </w:rPr>
+              <w:pStyle w:val="BodyText"/>
+              <w:tabs>
+                <w:tab w:val="left" w:pos="183"/>
+              </w:tabs>
+              <w:ind w:left="139"/>
             </w:pPr>
             <w:r>
-              <w:rPr>
-                <w:b/>
-              </w:rPr>
               <w:t>64</w:t>
             </w:r>
           </w:p>
         </w:tc>
         <w:tc>
           <w:tcPr>
-            <w:tcW w:w="4349" w:type="dxa"/>
+            <w:tcW w:w="0" w:type="auto"/>
           </w:tcPr>
           <w:p>
             <w:pPr>
-              <w:pStyle w:val="TableParagraph"/>
-              <w:spacing w:line="240" w:lineRule="exact"/>
-              <w:ind w:left="805"/>
-              <w:rPr>
-                <w:b/>
-              </w:rPr>
+              <w:pStyle w:val="BodyText"/>
+              <w:tabs>
+                <w:tab w:val="left" w:pos="183"/>
+              </w:tabs>
+              <w:ind w:left="139"/>
             </w:pPr>
             <w:r>
-              <w:rPr>
-                <w:b/>
-              </w:rPr>
               <w:t>36</w:t>
             </w:r>
           </w:p>
@@ -19502,96 +19118,51 @@
         </w:trPr>
         <w:tc>
           <w:tcPr>
-            <w:tcW w:w="2850" w:type="dxa"/>
+            <w:tcW w:w="0" w:type="auto"/>
           </w:tcPr>
           <w:p>
             <w:pPr>
-              <w:pStyle w:val="TableParagraph"/>
-              <w:spacing w:line="239" w:lineRule="exact"/>
-              <w:rPr>
-                <w:b/>
-              </w:rPr>
+              <w:pStyle w:val="BodyText"/>
+              <w:tabs>
+                <w:tab w:val="left" w:pos="183"/>
+              </w:tabs>
+              <w:ind w:left="139"/>
             </w:pPr>
             <w:r>
-              <w:rPr>
-                <w:b/>
-                <w:spacing w:val="-1"/>
-                <w:w w:val="95"/>
-              </w:rPr>
-              <w:t>Sample</w:t>
-            </w:r>
-            <w:r>
-              <w:rPr>
-                <w:b/>
-                <w:spacing w:val="-10"/>
-                <w:w w:val="95"/>
-              </w:rPr>
-              <w:t xml:space="preserve"> </w:t>
-            </w:r>
-            <w:r>
-              <w:rPr>
-                <w:b/>
-                <w:spacing w:val="-1"/>
-                <w:w w:val="95"/>
-              </w:rPr>
-              <w:t>Mean</w:t>
-            </w:r>
-            <w:r>
-              <w:rPr>
-                <w:b/>
-                <w:spacing w:val="-10"/>
-                <w:w w:val="95"/>
-              </w:rPr>
-              <w:t xml:space="preserve"> </w:t>
-            </w:r>
-            <w:r>
-              <w:rPr>
-                <w:b/>
-                <w:w w:val="95"/>
-              </w:rPr>
-              <w:t>Marks</w:t>
+              <w:t>Sample Mean Marks</w:t>
             </w:r>
           </w:p>
         </w:tc>
         <w:tc>
           <w:tcPr>
-            <w:tcW w:w="2162" w:type="dxa"/>
+            <w:tcW w:w="0" w:type="auto"/>
           </w:tcPr>
           <w:p>
             <w:pPr>
-              <w:pStyle w:val="TableParagraph"/>
-              <w:spacing w:line="239" w:lineRule="exact"/>
-              <w:ind w:left="760" w:right="831"/>
-              <w:jc w:val="center"/>
-              <w:rPr>
-                <w:b/>
-              </w:rPr>
+              <w:pStyle w:val="BodyText"/>
+              <w:tabs>
+                <w:tab w:val="left" w:pos="183"/>
+              </w:tabs>
+              <w:ind w:left="139"/>
             </w:pPr>
             <w:r>
-              <w:rPr>
-                <w:b/>
-              </w:rPr>
               <w:t>44</w:t>
             </w:r>
           </w:p>
         </w:tc>
         <w:tc>
           <w:tcPr>
-            <w:tcW w:w="4349" w:type="dxa"/>
+            <w:tcW w:w="0" w:type="auto"/>
           </w:tcPr>
           <w:p>
             <w:pPr>
-              <w:pStyle w:val="TableParagraph"/>
-              <w:spacing w:line="239" w:lineRule="exact"/>
-              <w:ind w:left="805"/>
-              <w:rPr>
-                <w:b/>
-              </w:rPr>
+              <w:pStyle w:val="BodyText"/>
+              <w:tabs>
+                <w:tab w:val="left" w:pos="183"/>
+              </w:tabs>
+              <w:ind w:left="139"/>
             </w:pPr>
             <w:r>
-              <w:rPr>
-                <w:b/>
-              </w:rPr>
               <w:t>41</w:t>
             </w:r>
           </w:p>
@@ -19603,95 +19174,51 @@
         </w:trPr>
         <w:tc>
           <w:tcPr>
-            <w:tcW w:w="2850" w:type="dxa"/>
+            <w:tcW w:w="0" w:type="auto"/>
           </w:tcPr>
           <w:p>
             <w:pPr>
-              <w:pStyle w:val="TableParagraph"/>
-              <w:spacing w:line="224" w:lineRule="exact"/>
-              <w:rPr>
-                <w:b/>
-              </w:rPr>
+              <w:pStyle w:val="BodyText"/>
+              <w:tabs>
+                <w:tab w:val="left" w:pos="183"/>
+              </w:tabs>
+              <w:ind w:left="139"/>
             </w:pPr>
             <w:r>
-              <w:rPr>
-                <w:b/>
-                <w:spacing w:val="-1"/>
-                <w:w w:val="95"/>
-              </w:rPr>
-              <w:t>Population</w:t>
-            </w:r>
-            <w:r>
-              <w:rPr>
-                <w:b/>
-                <w:spacing w:val="-9"/>
-                <w:w w:val="95"/>
-              </w:rPr>
-              <w:t xml:space="preserve"> </w:t>
-            </w:r>
-            <w:r>
-              <w:rPr>
-                <w:b/>
-                <w:w w:val="95"/>
-              </w:rPr>
-              <w:t>Variance</w:t>
-            </w:r>
-            <w:r>
-              <w:rPr>
-                <w:b/>
-                <w:spacing w:val="-8"/>
-                <w:w w:val="95"/>
-              </w:rPr>
-              <w:t xml:space="preserve"> </w:t>
-            </w:r>
-            <w:r>
-              <w:rPr>
-                <w:b/>
-                <w:w w:val="95"/>
-              </w:rPr>
-              <w:t>()</w:t>
+              <w:t>Population Variance ()</w:t>
             </w:r>
           </w:p>
         </w:tc>
         <w:tc>
           <w:tcPr>
-            <w:tcW w:w="2162" w:type="dxa"/>
+            <w:tcW w:w="0" w:type="auto"/>
           </w:tcPr>
           <w:p>
             <w:pPr>
-              <w:pStyle w:val="TableParagraph"/>
-              <w:spacing w:line="224" w:lineRule="exact"/>
-              <w:ind w:left="1210"/>
-              <w:rPr>
-                <w:b/>
-              </w:rPr>
+              <w:pStyle w:val="BodyText"/>
+              <w:tabs>
+                <w:tab w:val="left" w:pos="183"/>
+              </w:tabs>
+              <w:ind w:left="139"/>
             </w:pPr>
             <w:r>
-              <w:rPr>
-                <w:b/>
-              </w:rPr>
               <w:t>128</w:t>
             </w:r>
           </w:p>
         </w:tc>
         <w:tc>
           <w:tcPr>
-            <w:tcW w:w="4349" w:type="dxa"/>
+            <w:tcW w:w="0" w:type="auto"/>
           </w:tcPr>
           <w:p>
             <w:pPr>
-              <w:pStyle w:val="TableParagraph"/>
-              <w:spacing w:line="224" w:lineRule="exact"/>
-              <w:ind w:left="0" w:right="3157"/>
-              <w:jc w:val="right"/>
-              <w:rPr>
-                <w:b/>
-              </w:rPr>
+              <w:pStyle w:val="BodyText"/>
+              <w:tabs>
+                <w:tab w:val="left" w:pos="183"/>
+              </w:tabs>
+              <w:ind w:left="139"/>
             </w:pPr>
             <w:r>
-              <w:rPr>
-                <w:b/>
-              </w:rPr>
               <w:t>72</w:t>
             </w:r>
           </w:p>
@@ -19701,267 +19228,61 @@
     <w:p>
       <w:pPr>
         <w:pStyle w:val="BodyText"/>
-        <w:spacing w:before="7"/>
-        <w:rPr>
-          <w:sz w:val="19"/>
-        </w:rPr>
+        <w:tabs>
+          <w:tab w:val="left" w:pos="183"/>
+        </w:tabs>
       </w:pPr>
     </w:p>
     <w:p>
       <w:pPr>
         <w:pStyle w:val="BodyText"/>
-        <w:spacing w:before="64"/>
-        <w:ind w:left="139"/>
-      </w:pPr>
-      <w:r>
-        <w:rPr>
-          <w:color w:val="333333"/>
-          <w:spacing w:val="-2"/>
-          <w:w w:val="95"/>
-          <w:shd w:val="clear" w:color="auto" w:fill="F8F8F8"/>
-        </w:rPr>
-        <w:t>What</w:t>
-      </w:r>
-      <w:r>
-        <w:rPr>
-          <w:color w:val="333333"/>
-          <w:spacing w:val="-9"/>
-          <w:w w:val="95"/>
-          <w:shd w:val="clear" w:color="auto" w:fill="F8F8F8"/>
-        </w:rPr>
-        <w:t xml:space="preserve"> </w:t>
-      </w:r>
-      <w:r>
-        <w:rPr>
-          <w:color w:val="333333"/>
-          <w:spacing w:val="-2"/>
-          <w:w w:val="95"/>
-          <w:shd w:val="clear" w:color="auto" w:fill="F8F8F8"/>
-        </w:rPr>
-        <w:t>is</w:t>
-      </w:r>
-      <w:r>
-        <w:rPr>
-          <w:color w:val="333333"/>
-          <w:spacing w:val="-8"/>
-          <w:w w:val="95"/>
-          <w:shd w:val="clear" w:color="auto" w:fill="F8F8F8"/>
-        </w:rPr>
-        <w:t xml:space="preserve"> </w:t>
-      </w:r>
-      <w:r>
-        <w:rPr>
-          <w:color w:val="333333"/>
-          <w:spacing w:val="-2"/>
-          <w:w w:val="95"/>
-          <w:shd w:val="clear" w:color="auto" w:fill="F8F8F8"/>
-        </w:rPr>
-        <w:t>the</w:t>
-      </w:r>
-      <w:r>
-        <w:rPr>
-          <w:color w:val="333333"/>
-          <w:spacing w:val="-7"/>
-          <w:w w:val="95"/>
-          <w:shd w:val="clear" w:color="auto" w:fill="F8F8F8"/>
-        </w:rPr>
-        <w:t xml:space="preserve"> </w:t>
-      </w:r>
-      <w:r>
-        <w:rPr>
-          <w:color w:val="333333"/>
-          <w:spacing w:val="-2"/>
-          <w:w w:val="95"/>
-          <w:shd w:val="clear" w:color="auto" w:fill="F8F8F8"/>
-        </w:rPr>
-        <w:t>standard</w:t>
-      </w:r>
-      <w:r>
-        <w:rPr>
-          <w:color w:val="333333"/>
-          <w:spacing w:val="-5"/>
-          <w:w w:val="95"/>
-          <w:shd w:val="clear" w:color="auto" w:fill="F8F8F8"/>
-        </w:rPr>
-        <w:t xml:space="preserve"> </w:t>
-      </w:r>
-      <w:r>
-        <w:rPr>
-          <w:color w:val="333333"/>
-          <w:spacing w:val="-1"/>
-          <w:w w:val="95"/>
-          <w:shd w:val="clear" w:color="auto" w:fill="F8F8F8"/>
-        </w:rPr>
-        <w:t>error</w:t>
-      </w:r>
-      <w:r>
-        <w:rPr>
-          <w:color w:val="333333"/>
-          <w:spacing w:val="-7"/>
-          <w:w w:val="95"/>
-          <w:shd w:val="clear" w:color="auto" w:fill="F8F8F8"/>
-        </w:rPr>
-        <w:t xml:space="preserve"> </w:t>
-      </w:r>
-      <w:r>
-        <w:rPr>
-          <w:color w:val="333333"/>
-          <w:spacing w:val="-1"/>
-          <w:w w:val="95"/>
-          <w:shd w:val="clear" w:color="auto" w:fill="F8F8F8"/>
-        </w:rPr>
-        <w:t>for</w:t>
-      </w:r>
-      <w:r>
-        <w:rPr>
-          <w:color w:val="333333"/>
-          <w:spacing w:val="-5"/>
-          <w:w w:val="95"/>
-          <w:shd w:val="clear" w:color="auto" w:fill="F8F8F8"/>
-        </w:rPr>
-        <w:t xml:space="preserve"> </w:t>
-      </w:r>
-      <w:r>
-        <w:rPr>
-          <w:color w:val="333333"/>
-          <w:spacing w:val="-1"/>
-          <w:w w:val="95"/>
-          <w:shd w:val="clear" w:color="auto" w:fill="F8F8F8"/>
-        </w:rPr>
-        <w:t>the</w:t>
-      </w:r>
-      <w:r>
-        <w:rPr>
-          <w:color w:val="333333"/>
-          <w:spacing w:val="-5"/>
-          <w:w w:val="95"/>
-          <w:shd w:val="clear" w:color="auto" w:fill="F8F8F8"/>
-        </w:rPr>
-        <w:t xml:space="preserve"> </w:t>
-      </w:r>
-      <w:r>
-        <w:rPr>
-          <w:color w:val="333333"/>
-          <w:spacing w:val="-1"/>
-          <w:w w:val="95"/>
-          <w:shd w:val="clear" w:color="auto" w:fill="F8F8F8"/>
-        </w:rPr>
-        <w:t>difference</w:t>
-      </w:r>
-      <w:r>
-        <w:rPr>
-          <w:color w:val="333333"/>
-          <w:spacing w:val="-8"/>
-          <w:w w:val="95"/>
-          <w:shd w:val="clear" w:color="auto" w:fill="F8F8F8"/>
-        </w:rPr>
-        <w:t xml:space="preserve"> </w:t>
-      </w:r>
-      <w:r>
-        <w:rPr>
-          <w:color w:val="333333"/>
-          <w:spacing w:val="-1"/>
-          <w:w w:val="95"/>
-          <w:shd w:val="clear" w:color="auto" w:fill="F8F8F8"/>
-        </w:rPr>
-        <w:t>between</w:t>
-      </w:r>
-      <w:r>
-        <w:rPr>
-          <w:color w:val="333333"/>
-          <w:spacing w:val="-7"/>
-          <w:w w:val="95"/>
-          <w:shd w:val="clear" w:color="auto" w:fill="F8F8F8"/>
-        </w:rPr>
-        <w:t xml:space="preserve"> </w:t>
-      </w:r>
-      <w:r>
-        <w:rPr>
-          <w:color w:val="333333"/>
-          <w:spacing w:val="-1"/>
-          <w:w w:val="95"/>
-          <w:shd w:val="clear" w:color="auto" w:fill="F8F8F8"/>
-        </w:rPr>
-        <w:t>the</w:t>
-      </w:r>
-      <w:r>
-        <w:rPr>
-          <w:color w:val="333333"/>
-          <w:spacing w:val="-7"/>
-          <w:w w:val="95"/>
-          <w:shd w:val="clear" w:color="auto" w:fill="F8F8F8"/>
-        </w:rPr>
-        <w:t xml:space="preserve"> </w:t>
-      </w:r>
-      <w:r>
-        <w:rPr>
-          <w:color w:val="333333"/>
-          <w:spacing w:val="-1"/>
-          <w:w w:val="95"/>
-          <w:shd w:val="clear" w:color="auto" w:fill="F8F8F8"/>
-        </w:rPr>
-        <w:t>two</w:t>
-      </w:r>
-      <w:r>
-        <w:rPr>
-          <w:color w:val="333333"/>
-          <w:spacing w:val="-7"/>
-          <w:w w:val="95"/>
-          <w:shd w:val="clear" w:color="auto" w:fill="F8F8F8"/>
-        </w:rPr>
-        <w:t xml:space="preserve"> </w:t>
-      </w:r>
-      <w:r>
-        <w:rPr>
-          <w:color w:val="333333"/>
-          <w:spacing w:val="-1"/>
-          <w:w w:val="95"/>
-          <w:shd w:val="clear" w:color="auto" w:fill="F8F8F8"/>
-        </w:rPr>
-        <w:t>means</w:t>
-      </w:r>
-      <w:r>
-        <w:rPr>
-          <w:color w:val="333333"/>
-          <w:spacing w:val="-5"/>
-          <w:w w:val="95"/>
-          <w:shd w:val="clear" w:color="auto" w:fill="F8F8F8"/>
-        </w:rPr>
-        <w:t xml:space="preserve"> </w:t>
-      </w:r>
-      <w:r>
-        <w:rPr>
-          <w:color w:val="333333"/>
-          <w:spacing w:val="-1"/>
-          <w:w w:val="95"/>
-          <w:shd w:val="clear" w:color="auto" w:fill="F8F8F8"/>
-        </w:rPr>
-        <w:t>?</w:t>
-      </w:r>
+        <w:tabs>
+          <w:tab w:val="left" w:pos="183"/>
+        </w:tabs>
+      </w:pPr>
     </w:p>
     <w:p>
       <w:pPr>
         <w:pStyle w:val="BodyText"/>
-        <w:rPr>
-          <w:sz w:val="20"/>
-        </w:rPr>
+        <w:tabs>
+          <w:tab w:val="left" w:pos="183"/>
+        </w:tabs>
       </w:pPr>
     </w:p>
     <w:p>
       <w:pPr>
         <w:pStyle w:val="BodyText"/>
-        <w:rPr>
-          <w:sz w:val="20"/>
-        </w:rPr>
+        <w:tabs>
+          <w:tab w:val="left" w:pos="183"/>
+        </w:tabs>
       </w:pPr>
     </w:p>
     <w:p>
       <w:pPr>
         <w:pStyle w:val="BodyText"/>
-        <w:spacing w:before="7"/>
-        <w:rPr>
-          <w:sz w:val="23"/>
-        </w:rPr>
+        <w:tabs>
+          <w:tab w:val="left" w:pos="183"/>
+        </w:tabs>
+      </w:pPr>
+    </w:p>
+    <w:p>
+      <w:pPr>
+        <w:pStyle w:val="BodyText"/>
+        <w:tabs>
+          <w:tab w:val="left" w:pos="183"/>
+        </w:tabs>
+      </w:pPr>
+      <w:r>
+        <w:t>What is the standard error for the difference between the two means ?</w:t>
+      </w:r>
+    </w:p>
+    <w:p>
+      <w:pPr>
+        <w:sectPr>
+          <w:pgSz w:w="12240" w:h="15840"/>
+          <w:pgMar w:top="1500" w:right="160" w:bottom="280" w:left="1300" w:header="720" w:footer="720" w:gutter="0"/>
+          <w:cols w:space="720"/>
+        </w:sectPr>
       </w:pPr>
     </w:p>
     <w:p>
@@ -19975,6 +19296,7 @@
           <w:w w:val="95"/>
           <w:shd w:val="clear" w:color="auto" w:fill="F8F8F8"/>
         </w:rPr>
+        <w:lastRenderedPageBreak/>
         <w:t>WEEK</w:t>
       </w:r>
       <w:r>
@@ -20108,7 +19430,25 @@
           <w:w w:val="95"/>
           <w:shd w:val="clear" w:color="auto" w:fill="F8F8F8"/>
         </w:rPr>
-        <w:t>way Anova?</w:t>
+        <w:t xml:space="preserve">way </w:t>
+      </w:r>
+      <w:proofErr w:type="spellStart"/>
+      <w:r>
+        <w:rPr>
+          <w:b/>
+          <w:w w:val="95"/>
+          <w:shd w:val="clear" w:color="auto" w:fill="F8F8F8"/>
+        </w:rPr>
+        <w:t>Anova</w:t>
+      </w:r>
+      <w:proofErr w:type="spellEnd"/>
+      <w:r>
+        <w:rPr>
+          <w:b/>
+          <w:w w:val="95"/>
+          <w:shd w:val="clear" w:color="auto" w:fill="F8F8F8"/>
+        </w:rPr>
+        <w:t>?</w:t>
       </w:r>
     </w:p>
     <w:p>
@@ -22159,6 +21499,7 @@
               </w:rPr>
               <w:t xml:space="preserve"> </w:t>
             </w:r>
+            <w:proofErr w:type="spellStart"/>
             <w:r>
               <w:rPr>
                 <w:b/>
@@ -22168,6 +21509,7 @@
               </w:rPr>
               <w:t>litre</w:t>
             </w:r>
+            <w:proofErr w:type="spellEnd"/>
           </w:p>
         </w:tc>
       </w:tr>
@@ -22312,6 +21654,7 @@
               <w:ind w:left="912"/>
               <w:rPr>
                 <w:b/>
+                <w:color w:val="333333"/>
               </w:rPr>
             </w:pPr>
             <w:r>
@@ -22324,47 +21667,23 @@
           </w:p>
         </w:tc>
       </w:tr>
-    </w:tbl>
-    <w:p>
-      <w:pPr>
-        <w:sectPr>
-          <w:pgSz w:w="12240" w:h="15840"/>
-          <w:pgMar w:top="1440" w:right="160" w:bottom="280" w:left="1300" w:header="720" w:footer="720" w:gutter="0"/>
-          <w:cols w:space="720"/>
-        </w:sectPr>
-      </w:pPr>
-    </w:p>
-    <w:tbl>
-      <w:tblPr>
-        <w:tblW w:w="0" w:type="auto"/>
-        <w:tblInd w:w="147" w:type="dxa"/>
-        <w:tblLayout w:type="fixed"/>
-        <w:tblCellMar>
-          <w:left w:w="0" w:type="dxa"/>
-          <w:right w:w="0" w:type="dxa"/>
-        </w:tblCellMar>
-        <w:tblLook w:val="01E0" w:firstRow="1" w:lastRow="1" w:firstColumn="1" w:lastColumn="1" w:noHBand="0" w:noVBand="0"/>
-      </w:tblPr>
-      <w:tblGrid>
-        <w:gridCol w:w="1904"/>
-        <w:gridCol w:w="7455"/>
-      </w:tblGrid>
       <w:tr>
         <w:trPr>
-          <w:trHeight w:val="408"/>
+          <w:trHeight w:val="651"/>
         </w:trPr>
         <w:tc>
           <w:tcPr>
-            <w:tcW w:w="1904" w:type="dxa"/>
+            <w:tcW w:w="1967" w:type="dxa"/>
             <w:shd w:val="clear" w:color="auto" w:fill="F8F8F8"/>
           </w:tcPr>
           <w:p>
             <w:pPr>
               <w:pStyle w:val="TableParagraph"/>
-              <w:spacing w:line="249" w:lineRule="exact"/>
-              <w:ind w:left="715"/>
+              <w:spacing w:before="118"/>
+              <w:ind w:left="719"/>
               <w:rPr>
                 <w:b/>
+                <w:color w:val="333333"/>
               </w:rPr>
             </w:pPr>
             <w:r>
@@ -22372,23 +21691,23 @@
                 <w:b/>
                 <w:color w:val="333333"/>
               </w:rPr>
-              <w:lastRenderedPageBreak/>
               <w:t>34</w:t>
             </w:r>
           </w:p>
         </w:tc>
         <w:tc>
           <w:tcPr>
-            <w:tcW w:w="7455" w:type="dxa"/>
+            <w:tcW w:w="7392" w:type="dxa"/>
             <w:shd w:val="clear" w:color="auto" w:fill="F8F8F8"/>
           </w:tcPr>
           <w:p>
             <w:pPr>
               <w:pStyle w:val="TableParagraph"/>
-              <w:spacing w:line="249" w:lineRule="exact"/>
-              <w:ind w:left="975"/>
+              <w:spacing w:before="118"/>
+              <w:ind w:left="912"/>
               <w:rPr>
                 <w:b/>
+                <w:color w:val="333333"/>
               </w:rPr>
             </w:pPr>
             <w:r>
@@ -22403,20 +21722,21 @@
       </w:tr>
       <w:tr>
         <w:trPr>
-          <w:trHeight w:val="530"/>
+          <w:trHeight w:val="651"/>
         </w:trPr>
         <w:tc>
           <w:tcPr>
-            <w:tcW w:w="1904" w:type="dxa"/>
+            <w:tcW w:w="1967" w:type="dxa"/>
             <w:shd w:val="clear" w:color="auto" w:fill="F8F8F8"/>
           </w:tcPr>
           <w:p>
             <w:pPr>
               <w:pStyle w:val="TableParagraph"/>
               <w:spacing w:before="118"/>
-              <w:ind w:left="715"/>
+              <w:ind w:left="719"/>
               <w:rPr>
                 <w:b/>
+                <w:color w:val="333333"/>
               </w:rPr>
             </w:pPr>
             <w:r>
@@ -22430,16 +21750,17 @@
         </w:tc>
         <w:tc>
           <w:tcPr>
-            <w:tcW w:w="7455" w:type="dxa"/>
+            <w:tcW w:w="7392" w:type="dxa"/>
             <w:shd w:val="clear" w:color="auto" w:fill="F8F8F8"/>
           </w:tcPr>
           <w:p>
             <w:pPr>
               <w:pStyle w:val="TableParagraph"/>
               <w:spacing w:before="118"/>
-              <w:ind w:left="971"/>
+              <w:ind w:left="912"/>
               <w:rPr>
                 <w:b/>
+                <w:color w:val="333333"/>
               </w:rPr>
             </w:pPr>
             <w:r>
@@ -22454,20 +21775,21 @@
       </w:tr>
       <w:tr>
         <w:trPr>
-          <w:trHeight w:val="386"/>
+          <w:trHeight w:val="651"/>
         </w:trPr>
         <w:tc>
           <w:tcPr>
-            <w:tcW w:w="1904" w:type="dxa"/>
+            <w:tcW w:w="1967" w:type="dxa"/>
             <w:shd w:val="clear" w:color="auto" w:fill="F8F8F8"/>
           </w:tcPr>
           <w:p>
             <w:pPr>
               <w:pStyle w:val="TableParagraph"/>
-              <w:spacing w:before="118" w:line="248" w:lineRule="exact"/>
-              <w:ind w:left="715"/>
+              <w:spacing w:before="118"/>
+              <w:ind w:left="719"/>
               <w:rPr>
                 <w:b/>
+                <w:color w:val="333333"/>
               </w:rPr>
             </w:pPr>
             <w:r>
@@ -22481,16 +21803,17 @@
         </w:tc>
         <w:tc>
           <w:tcPr>
-            <w:tcW w:w="7455" w:type="dxa"/>
+            <w:tcW w:w="7392" w:type="dxa"/>
             <w:shd w:val="clear" w:color="auto" w:fill="F8F8F8"/>
           </w:tcPr>
           <w:p>
             <w:pPr>
               <w:pStyle w:val="TableParagraph"/>
-              <w:spacing w:before="118" w:line="248" w:lineRule="exact"/>
-              <w:ind w:left="971"/>
+              <w:spacing w:before="118"/>
+              <w:ind w:left="912"/>
               <w:rPr>
                 <w:b/>
+                <w:color w:val="333333"/>
               </w:rPr>
             </w:pPr>
             <w:r>
@@ -22506,50 +21829,11 @@
     </w:tbl>
     <w:p>
       <w:pPr>
-        <w:pStyle w:val="BodyText"/>
-        <w:rPr>
-          <w:sz w:val="20"/>
-        </w:rPr>
-      </w:pPr>
-    </w:p>
-    <w:p>
-      <w:pPr>
-        <w:pStyle w:val="BodyText"/>
-        <w:rPr>
-          <w:sz w:val="20"/>
-        </w:rPr>
-      </w:pPr>
-    </w:p>
-    <w:p>
-      <w:pPr>
-        <w:pStyle w:val="BodyText"/>
-        <w:rPr>
-          <w:sz w:val="20"/>
-        </w:rPr>
-      </w:pPr>
-    </w:p>
-    <w:p>
-      <w:pPr>
-        <w:pStyle w:val="BodyText"/>
-        <w:rPr>
-          <w:sz w:val="20"/>
-        </w:rPr>
-      </w:pPr>
-    </w:p>
-    <w:p>
-      <w:pPr>
-        <w:pStyle w:val="BodyText"/>
-        <w:rPr>
-          <w:sz w:val="20"/>
-        </w:rPr>
-      </w:pPr>
-    </w:p>
-    <w:p>
-      <w:pPr>
-        <w:pStyle w:val="BodyText"/>
-        <w:rPr>
-          <w:sz w:val="20"/>
-        </w:rPr>
+        <w:sectPr>
+          <w:pgSz w:w="12240" w:h="15840"/>
+          <w:pgMar w:top="1440" w:right="160" w:bottom="280" w:left="1300" w:header="720" w:footer="720" w:gutter="0"/>
+          <w:cols w:space="720"/>
+        </w:sectPr>
       </w:pPr>
     </w:p>
     <w:p>
@@ -24207,6 +23491,7 @@
         </w:rPr>
         <w:t xml:space="preserve"> </w:t>
       </w:r>
+      <w:proofErr w:type="spellStart"/>
       <w:r>
         <w:rPr>
           <w:b/>
@@ -24215,6 +23500,7 @@
         </w:rPr>
         <w:t>R.sq</w:t>
       </w:r>
+      <w:proofErr w:type="spellEnd"/>
       <w:r>
         <w:rPr>
           <w:b/>
@@ -29326,7 +28612,21 @@
         <w:rPr>
           <w:rFonts w:ascii="Trebuchet MS"/>
         </w:rPr>
-        <w:t>and discriminent analysis</w:t>
+        <w:t xml:space="preserve">and </w:t>
+      </w:r>
+      <w:proofErr w:type="spellStart"/>
+      <w:r>
+        <w:rPr>
+          <w:rFonts w:ascii="Trebuchet MS"/>
+        </w:rPr>
+        <w:t>discriminent</w:t>
+      </w:r>
+      <w:proofErr w:type="spellEnd"/>
+      <w:r>
+        <w:rPr>
+          <w:rFonts w:ascii="Trebuchet MS"/>
+        </w:rPr>
+        <w:t xml:space="preserve"> analysis</w:t>
       </w:r>
     </w:p>
     <w:p>
@@ -30008,6 +29308,7 @@
           <w:color w:val="333333"/>
         </w:rPr>
       </w:pPr>
+      <w:proofErr w:type="spellStart"/>
       <w:r>
         <w:rPr>
           <w:rFonts w:ascii="Georgia"/>
@@ -30016,6 +29317,7 @@
         </w:rPr>
         <w:t>Caculate</w:t>
       </w:r>
+      <w:proofErr w:type="spellEnd"/>
       <w:r>
         <w:rPr>
           <w:rFonts w:ascii="Georgia"/>
@@ -30092,6 +29394,7 @@
         </w:rPr>
         <w:t xml:space="preserve"> </w:t>
       </w:r>
+      <w:proofErr w:type="spellStart"/>
       <w:r>
         <w:rPr>
           <w:rFonts w:ascii="Georgia"/>
@@ -30100,6 +29403,7 @@
         </w:rPr>
         <w:t>manhattan</w:t>
       </w:r>
+      <w:proofErr w:type="spellEnd"/>
       <w:r>
         <w:rPr>
           <w:rFonts w:ascii="Georgia"/>
@@ -32367,13 +31671,23 @@
         </w:rPr>
         <w:t xml:space="preserve"> </w:t>
       </w:r>
+      <w:proofErr w:type="spellStart"/>
       <w:r>
         <w:rPr>
           <w:rFonts w:ascii="Georgia"/>
           <w:color w:val="333333"/>
           <w:sz w:val="21"/>
         </w:rPr>
-        <w:t>dendogram?</w:t>
+        <w:t>dendogram</w:t>
+      </w:r>
+      <w:proofErr w:type="spellEnd"/>
+      <w:r>
+        <w:rPr>
+          <w:rFonts w:ascii="Georgia"/>
+          <w:color w:val="333333"/>
+          <w:sz w:val="21"/>
+        </w:rPr>
+        <w:t>?</w:t>
       </w:r>
     </w:p>
     <w:p>
@@ -33743,6 +33057,7 @@
         </w:rPr>
         <w:t xml:space="preserve"> </w:t>
       </w:r>
+      <w:proofErr w:type="gramStart"/>
       <w:r>
         <w:rPr>
           <w:rFonts w:ascii="Georgia"/>
@@ -33751,6 +33066,7 @@
         </w:rPr>
         <w:t>pruning</w:t>
       </w:r>
+      <w:proofErr w:type="gramEnd"/>
       <w:r>
         <w:rPr>
           <w:rFonts w:ascii="Georgia"/>
@@ -34195,7 +33511,7 @@
           <w:noProof/>
         </w:rPr>
         <w:drawing>
-          <wp:anchor distT="0" distB="0" distL="0" distR="0" simplePos="0" relativeHeight="4" behindDoc="0" locked="0" layoutInCell="1" allowOverlap="1" wp14:anchorId="1331844F" wp14:editId="6DAD7FBF">
+          <wp:anchor distT="0" distB="0" distL="0" distR="0" simplePos="0" relativeHeight="251657216" behindDoc="0" locked="0" layoutInCell="1" allowOverlap="1" wp14:anchorId="1331844F" wp14:editId="6DAD7FBF">
             <wp:simplePos x="0" y="0"/>
             <wp:positionH relativeFrom="page">
               <wp:posOffset>895350</wp:posOffset>
@@ -34295,12 +33611,11 @@
         <w:pStyle w:val="ListParagraph"/>
         <w:numPr>
           <w:ilvl w:val="0"/>
-          <w:numId w:val="1"/>
+          <w:numId w:val="2"/>
         </w:numPr>
         <w:tabs>
           <w:tab w:val="left" w:pos="452"/>
         </w:tabs>
-        <w:ind w:hanging="313"/>
         <w:rPr>
           <w:rFonts w:ascii="Georgia"/>
           <w:sz w:val="24"/>
@@ -34492,12 +33807,11 @@
         <w:pStyle w:val="ListParagraph"/>
         <w:numPr>
           <w:ilvl w:val="0"/>
-          <w:numId w:val="1"/>
+          <w:numId w:val="2"/>
         </w:numPr>
         <w:tabs>
           <w:tab w:val="left" w:pos="452"/>
         </w:tabs>
-        <w:ind w:hanging="313"/>
         <w:rPr>
           <w:rFonts w:ascii="Georgia"/>
           <w:sz w:val="24"/>
@@ -35501,7 +34815,7 @@
   <w:abstractNum w:abstractNumId="7" w15:restartNumberingAfterBreak="0">
     <w:nsid w:val="58EF1D59"/>
     <w:multiLevelType w:val="hybridMultilevel"/>
-    <w:tmpl w:val="14A083BA"/>
+    <w:tmpl w:val="ED963D96"/>
     <w:lvl w:ilvl="0" w:tplc="DEEE0B7A">
       <w:start w:val="1"/>
       <w:numFmt w:val="decimal"/>
@@ -37278,6 +36592,7 @@
   <w:style w:type="character" w:default="1" w:styleId="DefaultParagraphFont">
     <w:name w:val="Default Paragraph Font"/>
     <w:uiPriority w:val="1"/>
+    <w:semiHidden/>
     <w:unhideWhenUsed/>
   </w:style>
   <w:style w:type="table" w:default="1" w:styleId="TableNormal">
@@ -37304,6 +36619,7 @@
   <w:style w:type="paragraph" w:styleId="BodyText">
     <w:name w:val="Body Text"/>
     <w:basedOn w:val="Normal"/>
+    <w:link w:val="BodyTextChar"/>
     <w:uiPriority w:val="1"/>
     <w:qFormat/>
     <w:rPr>
@@ -37328,6 +36644,34 @@
     <w:pPr>
       <w:ind w:left="-1"/>
     </w:pPr>
+  </w:style>
+  <w:style w:type="character" w:customStyle="1" w:styleId="BodyTextChar">
+    <w:name w:val="Body Text Char"/>
+    <w:basedOn w:val="DefaultParagraphFont"/>
+    <w:link w:val="BodyText"/>
+    <w:uiPriority w:val="1"/>
+    <w:rsid w:val="005365A1"/>
+    <w:rPr>
+      <w:rFonts w:ascii="Times New Roman" w:eastAsia="Times New Roman" w:hAnsi="Times New Roman" w:cs="Times New Roman"/>
+      <w:b/>
+      <w:bCs/>
+    </w:rPr>
+  </w:style>
+  <w:style w:type="table" w:styleId="TableGrid">
+    <w:name w:val="Table Grid"/>
+    <w:basedOn w:val="TableNormal"/>
+    <w:uiPriority w:val="39"/>
+    <w:rsid w:val="008B578D"/>
+    <w:tblPr>
+      <w:tblBorders>
+        <w:top w:val="single" w:sz="4" w:space="0" w:color="auto"/>
+        <w:left w:val="single" w:sz="4" w:space="0" w:color="auto"/>
+        <w:bottom w:val="single" w:sz="4" w:space="0" w:color="auto"/>
+        <w:right w:val="single" w:sz="4" w:space="0" w:color="auto"/>
+        <w:insideH w:val="single" w:sz="4" w:space="0" w:color="auto"/>
+        <w:insideV w:val="single" w:sz="4" w:space="0" w:color="auto"/>
+      </w:tblBorders>
+    </w:tblPr>
   </w:style>
 </w:styles>
 </file>

</xml_diff>